<commit_message>
Se revisa informe ajustado a la rúbrica
</commit_message>
<xml_diff>
--- a/APTC106_s6grupo6.docx
+++ b/APTC106_s6grupo6.docx
@@ -1,6 +1,6 @@
 
 <file path=word/document.xml><?xml version="1.0" encoding="utf-8"?>
-<w:document xmlns:wpc="http://schemas.microsoft.com/office/word/2010/wordprocessingCanvas" xmlns:cx="http://schemas.microsoft.com/office/drawing/2014/chartex" xmlns:cx1="http://schemas.microsoft.com/office/drawing/2015/9/8/chartex" xmlns:cx2="http://schemas.microsoft.com/office/drawing/2015/10/21/chartex" xmlns:cx3="http://schemas.microsoft.com/office/drawing/2016/5/9/chartex" xmlns:cx4="http://schemas.microsoft.com/office/drawing/2016/5/10/chartex" xmlns:cx5="http://schemas.microsoft.com/office/drawing/2016/5/11/chartex" xmlns:cx6="http://schemas.microsoft.com/office/drawing/2016/5/12/chartex" xmlns:cx7="http://schemas.microsoft.com/office/drawing/2016/5/13/chartex" xmlns:cx8="http://schemas.microsoft.com/office/drawing/2016/5/14/chartex" xmlns:mc="http://schemas.openxmlformats.org/markup-compatibility/2006" xmlns:aink="http://schemas.microsoft.com/office/drawing/2016/ink" xmlns:am3d="http://schemas.microsoft.com/office/drawing/2017/model3d" xmlns:o="urn:schemas-microsoft-com:office:office" xmlns:oel="http://schemas.microsoft.com/office/2019/extlst" xmlns:r="http://schemas.openxmlformats.org/officeDocument/2006/relationships" xmlns:m="http://schemas.openxmlformats.org/officeDocument/2006/math" xmlns:v="urn:schemas-microsoft-com:vml" xmlns:wp14="http://schemas.microsoft.com/office/word/2010/wordprocessingDrawing" xmlns:wp="http://schemas.openxmlformats.org/drawingml/2006/wordprocessingDrawing" xmlns:w10="urn:schemas-microsoft-com:office:word" xmlns:w="http://schemas.openxmlformats.org/wordprocessingml/2006/main" xmlns:w14="http://schemas.microsoft.com/office/word/2010/wordml" xmlns:w15="http://schemas.microsoft.com/office/word/2012/wordml" xmlns:w16cei="http://schemas.microsoft.com/office/word/2026/wordml/cei" xmlns:w16cex="http://schemas.microsoft.com/office/word/2018/wordml/cex" xmlns:w16cid="http://schemas.microsoft.com/office/word/2016/wordml/cid" xmlns:w16="http://schemas.microsoft.com/office/word/2018/wordml" xmlns:w16du="http://schemas.microsoft.com/office/word/2023/wordml/word16du" xmlns:w16sdtdh="http://schemas.microsoft.com/office/word/2020/wordml/sdtdatahash" xmlns:w16sdtfl="http://schemas.microsoft.com/office/word/2024/wordml/sdtformatlock" xmlns:w16se="http://schemas.microsoft.com/office/word/2015/wordml/symex" xmlns:wpg="http://schemas.microsoft.com/office/word/2010/wordprocessingGroup" xmlns:wpi="http://schemas.microsoft.com/office/word/2010/wordprocessingInk" xmlns:wne="http://schemas.microsoft.com/office/word/2006/wordml" xmlns:wps="http://schemas.microsoft.com/office/word/2010/wordprocessingShape" mc:Ignorable="w14 w15 w16se w16cid w16 w16cex w16sdtdh w16sdtfl w16du wp14">
+<w:document xmlns:wpc="http://schemas.microsoft.com/office/word/2010/wordprocessingCanvas" xmlns:cx="http://schemas.microsoft.com/office/drawing/2014/chartex" xmlns:cx1="http://schemas.microsoft.com/office/drawing/2015/9/8/chartex" xmlns:cx2="http://schemas.microsoft.com/office/drawing/2015/10/21/chartex" xmlns:cx3="http://schemas.microsoft.com/office/drawing/2016/5/9/chartex" xmlns:cx4="http://schemas.microsoft.com/office/drawing/2016/5/10/chartex" xmlns:cx5="http://schemas.microsoft.com/office/drawing/2016/5/11/chartex" xmlns:cx6="http://schemas.microsoft.com/office/drawing/2016/5/12/chartex" xmlns:cx7="http://schemas.microsoft.com/office/drawing/2016/5/13/chartex" xmlns:cx8="http://schemas.microsoft.com/office/drawing/2016/5/14/chartex" xmlns:mc="http://schemas.openxmlformats.org/markup-compatibility/2006" xmlns:aink="http://schemas.microsoft.com/office/drawing/2016/ink" xmlns:am3d="http://schemas.microsoft.com/office/drawing/2017/model3d" xmlns:o="urn:schemas-microsoft-com:office:office" xmlns:oel="http://schemas.microsoft.com/office/2019/extlst" xmlns:r="http://schemas.openxmlformats.org/officeDocument/2006/relationships" xmlns:m="http://schemas.openxmlformats.org/officeDocument/2006/math" xmlns:v="urn:schemas-microsoft-com:vml" xmlns:wp14="http://schemas.microsoft.com/office/word/2010/wordprocessingDrawing" xmlns:wp="http://schemas.openxmlformats.org/drawingml/2006/wordprocessingDrawing" xmlns:w10="urn:schemas-microsoft-com:office:word" xmlns:w="http://schemas.openxmlformats.org/wordprocessingml/2006/main" xmlns:w14="http://schemas.microsoft.com/office/word/2010/wordml" xmlns:w15="http://schemas.microsoft.com/office/word/2012/wordml" xmlns:w16cex="http://schemas.microsoft.com/office/word/2018/wordml/cex" xmlns:w16cid="http://schemas.microsoft.com/office/word/2016/wordml/cid" xmlns:w16="http://schemas.microsoft.com/office/word/2018/wordml" xmlns:w16du="http://schemas.microsoft.com/office/word/2023/wordml/word16du" xmlns:w16sdtdh="http://schemas.microsoft.com/office/word/2020/wordml/sdtdatahash" xmlns:w16sdtfl="http://schemas.microsoft.com/office/word/2024/wordml/sdtformatlock" xmlns:w16se="http://schemas.microsoft.com/office/word/2015/wordml/symex" xmlns:wpg="http://schemas.microsoft.com/office/word/2010/wordprocessingGroup" xmlns:wpi="http://schemas.microsoft.com/office/word/2010/wordprocessingInk" xmlns:wne="http://schemas.microsoft.com/office/word/2006/wordml" xmlns:wps="http://schemas.microsoft.com/office/word/2010/wordprocessingShape" mc:Ignorable="w14 w15 w16se w16cid w16 w16cex w16sdtdh w16sdtfl w16du wp14">
   <w:body>
     <w:p>
       <w:pPr>
@@ -11,11 +11,10 @@
           <w:right w:val="nil"/>
           <w:between w:val="nil"/>
         </w:pBdr>
+        <w:contextualSpacing/>
         <w:rPr>
           <w:rFonts w:eastAsia="Times New Roman"/>
           <w:color w:val="000000"/>
-          <w:sz w:val="20"/>
-          <w:szCs w:val="20"/>
         </w:rPr>
       </w:pPr>
     </w:p>
@@ -28,17 +27,16 @@
           <w:right w:val="nil"/>
           <w:between w:val="nil"/>
         </w:pBdr>
-        <w:spacing w:before="210"/>
-        <w:ind w:left="109"/>
-        <w:rPr>
-          <w:color w:val="231F20"/>
-          <w:sz w:val="28"/>
-          <w:szCs w:val="28"/>
-        </w:rPr>
-      </w:pPr>
-      <w:r>
-        <w:rPr>
-          <w:noProof/>
+        <w:contextualSpacing/>
+        <w:rPr>
+          <w:rFonts w:eastAsia="Times New Roman"/>
+          <w:color w:val="000000"/>
+        </w:rPr>
+      </w:pPr>
+      <w:r>
+        <w:rPr>
+          <w:rFonts w:eastAsia="Times New Roman"/>
+          <w:color w:val="000000"/>
         </w:rPr>
         <w:drawing>
           <wp:anchor distT="0" distB="0" distL="114300" distR="114300" simplePos="0" relativeHeight="251663360" behindDoc="0" locked="0" layoutInCell="1" allowOverlap="1" wp14:anchorId="40EB4CF8" wp14:editId="128A23D8">
@@ -103,14 +101,134 @@
           </wp:anchor>
         </w:drawing>
       </w:r>
-      <w:r>
-        <w:rPr>
-          <w:color w:val="231F20"/>
-          <w:sz w:val="28"/>
-          <w:szCs w:val="28"/>
-        </w:rPr>
-        <w:t xml:space="preserve"> </w:t>
-      </w:r>
+    </w:p>
+    <w:p>
+      <w:pPr>
+        <w:pBdr>
+          <w:top w:val="nil"/>
+          <w:left w:val="nil"/>
+          <w:bottom w:val="nil"/>
+          <w:right w:val="nil"/>
+          <w:between w:val="nil"/>
+        </w:pBdr>
+        <w:contextualSpacing/>
+        <w:rPr>
+          <w:rFonts w:eastAsia="Times New Roman"/>
+          <w:color w:val="000000"/>
+        </w:rPr>
+      </w:pPr>
+    </w:p>
+    <w:p>
+      <w:pPr>
+        <w:pBdr>
+          <w:top w:val="nil"/>
+          <w:left w:val="nil"/>
+          <w:bottom w:val="nil"/>
+          <w:right w:val="nil"/>
+          <w:between w:val="nil"/>
+        </w:pBdr>
+        <w:contextualSpacing/>
+        <w:rPr>
+          <w:rFonts w:eastAsia="Times New Roman"/>
+          <w:color w:val="000000"/>
+        </w:rPr>
+      </w:pPr>
+    </w:p>
+    <w:p>
+      <w:pPr>
+        <w:pBdr>
+          <w:top w:val="nil"/>
+          <w:left w:val="nil"/>
+          <w:bottom w:val="nil"/>
+          <w:right w:val="nil"/>
+          <w:between w:val="nil"/>
+        </w:pBdr>
+        <w:contextualSpacing/>
+        <w:rPr>
+          <w:rFonts w:eastAsia="Times New Roman"/>
+          <w:color w:val="000000"/>
+        </w:rPr>
+      </w:pPr>
+    </w:p>
+    <w:p>
+      <w:pPr>
+        <w:pBdr>
+          <w:top w:val="nil"/>
+          <w:left w:val="nil"/>
+          <w:bottom w:val="nil"/>
+          <w:right w:val="nil"/>
+          <w:between w:val="nil"/>
+        </w:pBdr>
+        <w:contextualSpacing/>
+        <w:rPr>
+          <w:rFonts w:eastAsia="Times New Roman"/>
+          <w:color w:val="000000"/>
+        </w:rPr>
+      </w:pPr>
+    </w:p>
+    <w:p>
+      <w:pPr>
+        <w:pBdr>
+          <w:top w:val="nil"/>
+          <w:left w:val="nil"/>
+          <w:bottom w:val="nil"/>
+          <w:right w:val="nil"/>
+          <w:between w:val="nil"/>
+        </w:pBdr>
+        <w:contextualSpacing/>
+        <w:rPr>
+          <w:rFonts w:eastAsia="Times New Roman"/>
+          <w:color w:val="000000"/>
+        </w:rPr>
+      </w:pPr>
+    </w:p>
+    <w:p>
+      <w:pPr>
+        <w:pBdr>
+          <w:top w:val="nil"/>
+          <w:left w:val="nil"/>
+          <w:bottom w:val="nil"/>
+          <w:right w:val="nil"/>
+          <w:between w:val="nil"/>
+        </w:pBdr>
+        <w:contextualSpacing/>
+        <w:rPr>
+          <w:rFonts w:eastAsia="Times New Roman"/>
+          <w:color w:val="000000"/>
+        </w:rPr>
+      </w:pPr>
+    </w:p>
+    <w:p>
+      <w:pPr>
+        <w:pBdr>
+          <w:top w:val="nil"/>
+          <w:left w:val="nil"/>
+          <w:bottom w:val="nil"/>
+          <w:right w:val="nil"/>
+          <w:between w:val="nil"/>
+        </w:pBdr>
+        <w:contextualSpacing/>
+        <w:rPr>
+          <w:rFonts w:eastAsia="Times New Roman"/>
+          <w:color w:val="000000"/>
+        </w:rPr>
+      </w:pPr>
+    </w:p>
+    <w:p>
+      <w:pPr>
+        <w:pBdr>
+          <w:top w:val="nil"/>
+          <w:left w:val="nil"/>
+          <w:bottom w:val="nil"/>
+          <w:right w:val="nil"/>
+          <w:between w:val="nil"/>
+        </w:pBdr>
+        <w:contextualSpacing/>
+        <w:rPr>
+          <w:rFonts w:eastAsia="Times New Roman"/>
+          <w:color w:val="000000"/>
+        </w:rPr>
+      </w:pPr>
     </w:p>
     <w:p>
       <w:pPr>
@@ -125,211 +243,78 @@
         <w:rPr>
           <w:b/>
           <w:color w:val="AD1F2B"/>
-          <w:sz w:val="28"/>
-          <w:szCs w:val="28"/>
-          <w:highlight w:val="yellow"/>
-        </w:rPr>
-      </w:pPr>
-    </w:p>
-    <w:p>
-      <w:pPr>
-        <w:pBdr>
-          <w:top w:val="nil"/>
-          <w:left w:val="nil"/>
-          <w:bottom w:val="nil"/>
-          <w:right w:val="nil"/>
-          <w:between w:val="nil"/>
-        </w:pBdr>
-        <w:spacing w:before="210"/>
-        <w:rPr>
-          <w:b/>
-          <w:color w:val="AD1F2B"/>
-          <w:sz w:val="28"/>
-          <w:szCs w:val="28"/>
-          <w:highlight w:val="yellow"/>
-        </w:rPr>
-      </w:pPr>
-    </w:p>
-    <w:p>
-      <w:pPr>
-        <w:pBdr>
-          <w:top w:val="nil"/>
-          <w:left w:val="nil"/>
-          <w:bottom w:val="nil"/>
-          <w:right w:val="nil"/>
-          <w:between w:val="nil"/>
-        </w:pBdr>
-        <w:spacing w:before="210"/>
-        <w:rPr>
-          <w:b/>
-          <w:color w:val="AD1F2B"/>
-          <w:sz w:val="28"/>
-          <w:szCs w:val="28"/>
-          <w:highlight w:val="yellow"/>
-        </w:rPr>
-      </w:pPr>
-    </w:p>
-    <w:p>
-      <w:pPr>
-        <w:pBdr>
-          <w:top w:val="nil"/>
-          <w:left w:val="nil"/>
-          <w:bottom w:val="nil"/>
-          <w:right w:val="nil"/>
-          <w:between w:val="nil"/>
-        </w:pBdr>
-        <w:spacing w:before="210"/>
-        <w:rPr>
-          <w:b/>
-          <w:color w:val="AD1F2B"/>
-          <w:sz w:val="28"/>
-          <w:szCs w:val="28"/>
-          <w:highlight w:val="yellow"/>
-        </w:rPr>
-      </w:pPr>
-    </w:p>
-    <w:p>
-      <w:pPr>
-        <w:pBdr>
-          <w:top w:val="nil"/>
-          <w:left w:val="nil"/>
-          <w:bottom w:val="nil"/>
-          <w:right w:val="nil"/>
-          <w:between w:val="nil"/>
-        </w:pBdr>
-        <w:spacing w:before="210"/>
-        <w:rPr>
-          <w:b/>
-          <w:color w:val="AD1F2B"/>
-          <w:sz w:val="28"/>
-          <w:szCs w:val="28"/>
-          <w:highlight w:val="yellow"/>
-        </w:rPr>
-      </w:pPr>
-    </w:p>
-    <w:p>
-      <w:pPr>
-        <w:pBdr>
-          <w:top w:val="nil"/>
-          <w:left w:val="nil"/>
-          <w:bottom w:val="nil"/>
-          <w:right w:val="nil"/>
-          <w:between w:val="nil"/>
-        </w:pBdr>
-        <w:spacing w:before="210"/>
-        <w:rPr>
-          <w:b/>
-          <w:color w:val="AD1F2B"/>
-          <w:sz w:val="28"/>
-          <w:szCs w:val="28"/>
-          <w:highlight w:val="yellow"/>
-        </w:rPr>
-      </w:pPr>
-    </w:p>
-    <w:p>
-      <w:pPr>
-        <w:pBdr>
-          <w:top w:val="nil"/>
-          <w:left w:val="nil"/>
-          <w:bottom w:val="nil"/>
-          <w:right w:val="nil"/>
-          <w:between w:val="nil"/>
-        </w:pBdr>
-        <w:spacing w:before="210"/>
-        <w:rPr>
-          <w:b/>
-          <w:color w:val="AD1F2B"/>
-          <w:sz w:val="28"/>
-          <w:szCs w:val="28"/>
-          <w:highlight w:val="yellow"/>
-        </w:rPr>
-      </w:pPr>
-    </w:p>
-    <w:p>
-      <w:pPr>
-        <w:pBdr>
-          <w:top w:val="nil"/>
-          <w:left w:val="nil"/>
-          <w:bottom w:val="nil"/>
-          <w:right w:val="nil"/>
-          <w:between w:val="nil"/>
-        </w:pBdr>
-        <w:spacing w:before="210"/>
+          <w:sz w:val="32"/>
+          <w:szCs w:val="32"/>
+        </w:rPr>
+      </w:pPr>
+      <w:r>
         <w:rPr>
           <w:b/>
           <w:color w:val="AD1F2B"/>
           <w:sz w:val="32"/>
           <w:szCs w:val="32"/>
         </w:rPr>
-      </w:pPr>
-      <w:r>
+        <w:t>APTC106</w:t>
+      </w:r>
+    </w:p>
+    <w:p>
+      <w:pPr>
+        <w:spacing w:before="246"/>
         <w:rPr>
           <w:b/>
           <w:color w:val="AD1F2B"/>
           <w:sz w:val="32"/>
           <w:szCs w:val="32"/>
         </w:rPr>
-        <w:t>APTC106</w:t>
-      </w:r>
-    </w:p>
-    <w:p>
-      <w:pPr>
-        <w:spacing w:before="246"/>
+      </w:pPr>
+      <w:r>
         <w:rPr>
           <w:b/>
           <w:color w:val="AD1F2B"/>
           <w:sz w:val="32"/>
           <w:szCs w:val="32"/>
         </w:rPr>
-      </w:pPr>
-      <w:r>
+        <w:t xml:space="preserve">Semana 6 </w:t>
+      </w:r>
+    </w:p>
+    <w:p>
+      <w:pPr>
+        <w:spacing w:before="246"/>
         <w:rPr>
           <w:b/>
           <w:color w:val="AD1F2B"/>
           <w:sz w:val="32"/>
           <w:szCs w:val="32"/>
         </w:rPr>
-        <w:t xml:space="preserve">Semana 6 </w:t>
-      </w:r>
-    </w:p>
-    <w:p>
-      <w:pPr>
-        <w:spacing w:before="246"/>
+      </w:pPr>
+      <w:r>
         <w:rPr>
           <w:b/>
           <w:color w:val="AD1F2B"/>
           <w:sz w:val="32"/>
           <w:szCs w:val="32"/>
         </w:rPr>
-      </w:pPr>
-      <w:r>
+        <w:t>Sumativa 2:</w:t>
+      </w:r>
+    </w:p>
+    <w:p>
+      <w:pPr>
+        <w:spacing w:before="246"/>
         <w:rPr>
           <w:b/>
           <w:color w:val="AD1F2B"/>
           <w:sz w:val="32"/>
           <w:szCs w:val="32"/>
         </w:rPr>
-        <w:t>Sumativa 2:</w:t>
-      </w:r>
-    </w:p>
-    <w:p>
-      <w:pPr>
-        <w:spacing w:before="246"/>
+      </w:pPr>
+      <w:r>
         <w:rPr>
           <w:b/>
           <w:color w:val="AD1F2B"/>
           <w:sz w:val="32"/>
           <w:szCs w:val="32"/>
         </w:rPr>
-      </w:pPr>
-      <w:r>
-        <w:rPr>
-          <w:b/>
-          <w:color w:val="AD1F2B"/>
-          <w:sz w:val="32"/>
-          <w:szCs w:val="32"/>
-        </w:rPr>
-        <w:t xml:space="preserve">Propuesta de Aplicación </w:t>
+        <w:t>Propuesta de Aplicación</w:t>
       </w:r>
     </w:p>
     <w:p>
@@ -344,6 +329,7 @@
       </w:pPr>
       <w:r>
         <w:rPr>
+          <w:noProof/>
           <w:color w:val="000000"/>
         </w:rPr>
         <mc:AlternateContent>
@@ -392,47 +378,16 @@
               </wp:anchor>
             </w:drawing>
           </mc:Choice>
-          <mc:Fallback xmlns:sl="http://schemas.openxmlformats.org/schemaLibrary/2006/main" xmlns:a="http://schemas.openxmlformats.org/drawingml/2006/main" xmlns:pic="http://schemas.openxmlformats.org/drawingml/2006/picture" xmlns:c="http://schemas.openxmlformats.org/drawingml/2006/chart" xmlns:lc="http://schemas.openxmlformats.org/drawingml/2006/lockedCanvas" xmlns:dgm="http://schemas.openxmlformats.org/drawingml/2006/diagram">
-            <w:drawing>
-              <wp:anchor allowOverlap="1" behindDoc="0" distB="4294967295" distT="4294967295" distL="0" distR="0" hidden="0" layoutInCell="1" locked="0" relativeHeight="0" simplePos="0">
-                <wp:simplePos x="0" y="0"/>
-                <wp:positionH relativeFrom="column">
-                  <wp:posOffset>63500</wp:posOffset>
-                </wp:positionH>
-                <wp:positionV relativeFrom="paragraph">
-                  <wp:posOffset>157496</wp:posOffset>
-                </wp:positionV>
-                <wp:extent cx="0" cy="12700"/>
-                <wp:effectExtent b="0" l="0" r="0" t="0"/>
-                <wp:wrapTopAndBottom distB="4294967295" distT="4294967295"/>
-                <wp:docPr id="28" name="image5.png"/>
-                <a:graphic>
-                  <a:graphicData uri="http://schemas.openxmlformats.org/drawingml/2006/picture">
-                    <pic:pic>
-                      <pic:nvPicPr>
-                        <pic:cNvPr id="0" name="image5.png"/>
-                        <pic:cNvPicPr preferRelativeResize="0"/>
-                      </pic:nvPicPr>
-                      <pic:blipFill>
-                        <a:blip r:embed="rId9"/>
-                        <a:srcRect/>
-                        <a:stretch>
-                          <a:fillRect/>
-                        </a:stretch>
-                      </pic:blipFill>
-                      <pic:spPr>
-                        <a:xfrm>
-                          <a:off x="0" y="0"/>
-                          <a:ext cx="0" cy="12700"/>
-                        </a:xfrm>
-                        <a:prstGeom prst="rect"/>
-                        <a:ln/>
-                      </pic:spPr>
-                    </pic:pic>
-                  </a:graphicData>
-                </a:graphic>
-              </wp:anchor>
-            </w:drawing>
+          <mc:Fallback>
+            <w:pict>
+              <v:shapetype w14:anchorId="6F850E73" id="_x0000_t32" coordsize="21600,21600" o:spt="32" o:oned="t" path="m,l21600,21600e" filled="f">
+                <v:path arrowok="t" fillok="f" o:connecttype="none"/>
+                <o:lock v:ext="edit" shapetype="t"/>
+              </v:shapetype>
+              <v:shape id="Conector recto de flecha 28" o:spid="_x0000_s1026" type="#_x0000_t32" style="position:absolute;margin-left:5pt;margin-top:12.4pt;width:0;height:1pt;z-index:251658240;visibility:visible;mso-wrap-style:square;mso-wrap-distance-left:0;mso-wrap-distance-top:-3e-5mm;mso-wrap-distance-right:0;mso-wrap-distance-bottom:-3e-5mm;mso-position-horizontal:absolute;mso-position-horizontal-relative:text;mso-position-vertical:absolute;mso-position-vertical-relative:text" o:gfxdata="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" strokecolor="#bcbec0">
+                <w10:wrap type="topAndBottom"/>
+              </v:shape>
+            </w:pict>
           </mc:Fallback>
         </mc:AlternateContent>
       </w:r>
@@ -504,300 +459,212 @@
           <w:szCs w:val="20"/>
         </w:rPr>
       </w:pPr>
-      <w:r>
-        <w:rPr>
-          <w:noProof/>
-        </w:rPr>
-        <mc:AlternateContent>
-          <mc:Choice Requires="wps">
-            <w:drawing>
-              <wp:anchor distT="0" distB="0" distL="114300" distR="114300" simplePos="0" relativeHeight="251659264" behindDoc="0" locked="0" layoutInCell="1" hidden="0" allowOverlap="1" wp14:anchorId="309056CB" wp14:editId="6D645740">
-                <wp:simplePos x="0" y="0"/>
-                <wp:positionH relativeFrom="column">
-                  <wp:posOffset>-12699</wp:posOffset>
-                </wp:positionH>
-                <wp:positionV relativeFrom="paragraph">
-                  <wp:posOffset>419100</wp:posOffset>
-                </wp:positionV>
-                <wp:extent cx="6377940" cy="305435"/>
-                <wp:effectExtent l="0" t="0" r="0" b="0"/>
-                <wp:wrapSquare wrapText="bothSides" distT="0" distB="0" distL="114300" distR="114300"/>
-                <wp:docPr id="27" name="Rectángulo 27"/>
-                <wp:cNvGraphicFramePr/>
-                <a:graphic xmlns:a="http://schemas.openxmlformats.org/drawingml/2006/main">
-                  <a:graphicData uri="http://schemas.microsoft.com/office/word/2010/wordprocessingShape">
-                    <wps:wsp>
-                      <wps:cNvSpPr/>
-                      <wps:spPr>
-                        <a:xfrm>
-                          <a:off x="2161793" y="3632045"/>
-                          <a:ext cx="6368415" cy="295910"/>
-                        </a:xfrm>
-                        <a:prstGeom prst="rect">
-                          <a:avLst/>
-                        </a:prstGeom>
-                        <a:noFill/>
-                        <a:ln>
-                          <a:noFill/>
-                        </a:ln>
-                      </wps:spPr>
-                      <wps:txbx>
-                        <w:txbxContent>
-                          <w:p>
-                            <w:pPr>
-                              <w:textDirection w:val="btLr"/>
-                              <w:rPr>
-                                <w:b/>
-                                <w:bCs/>
-                                <w:sz w:val="18"/>
-                                <w:szCs w:val="18"/>
-                              </w:rPr>
-                            </w:pPr>
-                            <w:r>
-                              <w:rPr>
-                                <w:b/>
-                                <w:bCs/>
-                                <w:color w:val="231F20"/>
-                                <w:szCs w:val="18"/>
-                              </w:rPr>
-                              <w:t>Nombres integrantes</w:t>
-                            </w:r>
-                            <w:r>
-                              <w:rPr>
-                                <w:b/>
-                                <w:bCs/>
-                                <w:color w:val="231F20"/>
-                                <w:szCs w:val="18"/>
-                              </w:rPr>
-                              <w:t>:</w:t>
-                            </w:r>
-                          </w:p>
-                        </w:txbxContent>
-                      </wps:txbx>
-                      <wps:bodyPr spcFirstLastPara="1" wrap="square" lIns="91425" tIns="45700" rIns="91425" bIns="45700" anchor="t" anchorCtr="0">
-                        <a:noAutofit/>
-                      </wps:bodyPr>
-                    </wps:wsp>
-                  </a:graphicData>
-                </a:graphic>
-              </wp:anchor>
-            </w:drawing>
-          </mc:Choice>
-          <mc:Fallback>
-            <w:pict>
-              <v:rect w14:anchorId="309056CB" id="Rectángulo 27" o:spid="_x0000_s1026" style="position:absolute;margin-left:-1pt;margin-top:33pt;width:502.2pt;height:24.05pt;z-index:251659264;visibility:visible;mso-wrap-style:square;mso-wrap-distance-left:9pt;mso-wrap-distance-top:0;mso-wrap-distance-right:9pt;mso-wrap-distance-bottom:0;mso-position-horizontal:absolute;mso-position-horizontal-relative:text;mso-position-vertical:absolute;mso-position-vertical-relative:text;v-text-anchor:top" o:gfxdata="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" filled="f" stroked="f">
-                <v:textbox inset="2.53958mm,1.2694mm,2.53958mm,1.2694mm">
-                  <w:txbxContent>
-                    <w:p>
-                      <w:pPr>
-                        <w:textDirection w:val="btLr"/>
-                        <w:rPr>
-                          <w:b/>
-                          <w:bCs/>
-                          <w:sz w:val="18"/>
-                          <w:szCs w:val="18"/>
-                        </w:rPr>
-                      </w:pPr>
-                      <w:r>
-                        <w:rPr>
-                          <w:b/>
-                          <w:bCs/>
-                          <w:color w:val="231F20"/>
-                          <w:szCs w:val="18"/>
-                        </w:rPr>
-                        <w:t>Nombres integrantes</w:t>
-                      </w:r>
-                      <w:r>
-                        <w:rPr>
-                          <w:b/>
-                          <w:bCs/>
-                          <w:color w:val="231F20"/>
-                          <w:szCs w:val="18"/>
-                        </w:rPr>
-                        <w:t>:</w:t>
-                      </w:r>
-                    </w:p>
-                  </w:txbxContent>
-                </v:textbox>
-                <w10:wrap type="square"/>
-              </v:rect>
-            </w:pict>
-          </mc:Fallback>
-        </mc:AlternateContent>
-      </w:r>
-      <w:r>
-        <w:rPr>
-          <w:noProof/>
-        </w:rPr>
-        <mc:AlternateContent>
-          <mc:Choice Requires="wps">
-            <w:drawing>
-              <wp:anchor distT="0" distB="0" distL="114300" distR="114300" simplePos="0" relativeHeight="251660288" behindDoc="0" locked="0" layoutInCell="1" hidden="0" allowOverlap="1" wp14:anchorId="40B165C0" wp14:editId="1205221C">
-                <wp:simplePos x="0" y="0"/>
-                <wp:positionH relativeFrom="column">
-                  <wp:posOffset>-12065</wp:posOffset>
-                </wp:positionH>
-                <wp:positionV relativeFrom="paragraph">
-                  <wp:posOffset>787400</wp:posOffset>
-                </wp:positionV>
-                <wp:extent cx="6377940" cy="324000"/>
-                <wp:effectExtent l="0" t="0" r="0" b="0"/>
-                <wp:wrapSquare wrapText="bothSides" distT="0" distB="0" distL="114300" distR="114300"/>
-                <wp:docPr id="30" name="Rectángulo 30"/>
-                <wp:cNvGraphicFramePr/>
-                <a:graphic xmlns:a="http://schemas.openxmlformats.org/drawingml/2006/main">
-                  <a:graphicData uri="http://schemas.microsoft.com/office/word/2010/wordprocessingShape">
-                    <wps:wsp>
-                      <wps:cNvSpPr/>
-                      <wps:spPr>
-                        <a:xfrm>
-                          <a:off x="0" y="0"/>
-                          <a:ext cx="6377940" cy="324000"/>
-                        </a:xfrm>
-                        <a:prstGeom prst="rect">
-                          <a:avLst/>
-                        </a:prstGeom>
-                        <a:noFill/>
-                        <a:ln>
-                          <a:noFill/>
-                        </a:ln>
-                      </wps:spPr>
-                      <wps:txbx>
-                        <w:txbxContent>
-                          <w:p>
-                            <w:pPr>
-                              <w:textDirection w:val="btLr"/>
-                            </w:pPr>
-                            <w:r>
-                              <w:t>Fernando Flores Tobar</w:t>
-                            </w:r>
-                          </w:p>
-                        </w:txbxContent>
-                      </wps:txbx>
-                      <wps:bodyPr spcFirstLastPara="1" wrap="square" lIns="91425" tIns="45700" rIns="91425" bIns="45700" anchor="t" anchorCtr="0">
-                        <a:noAutofit/>
-                      </wps:bodyPr>
-                    </wps:wsp>
-                  </a:graphicData>
-                </a:graphic>
-                <wp14:sizeRelV relativeFrom="margin">
-                  <wp14:pctHeight>0</wp14:pctHeight>
-                </wp14:sizeRelV>
-              </wp:anchor>
-            </w:drawing>
-          </mc:Choice>
-          <mc:Fallback>
-            <w:pict>
-              <v:rect w14:anchorId="40B165C0" id="Rectángulo 30" o:spid="_x0000_s1027" style="position:absolute;margin-left:-.95pt;margin-top:62pt;width:502.2pt;height:25.5pt;z-index:251660288;visibility:visible;mso-wrap-style:square;mso-height-percent:0;mso-wrap-distance-left:9pt;mso-wrap-distance-top:0;mso-wrap-distance-right:9pt;mso-wrap-distance-bottom:0;mso-position-horizontal:absolute;mso-position-horizontal-relative:text;mso-position-vertical:absolute;mso-position-vertical-relative:text;mso-height-percent:0;mso-height-relative:margin;v-text-anchor:top" o:gfxdata="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" filled="f" stroked="f">
-                <v:textbox inset="2.53958mm,1.2694mm,2.53958mm,1.2694mm">
-                  <w:txbxContent>
-                    <w:p>
-                      <w:pPr>
-                        <w:textDirection w:val="btLr"/>
-                      </w:pPr>
-                      <w:r>
-                        <w:t>Fernando Flores Tobar</w:t>
-                      </w:r>
-                    </w:p>
-                  </w:txbxContent>
-                </v:textbox>
-                <w10:wrap type="square"/>
-              </v:rect>
-            </w:pict>
-          </mc:Fallback>
-        </mc:AlternateContent>
-      </w:r>
-      <w:r>
-        <w:rPr>
-          <w:noProof/>
-        </w:rPr>
-        <mc:AlternateContent>
-          <mc:Choice Requires="wps">
-            <w:drawing>
-              <wp:anchor distT="0" distB="0" distL="114300" distR="114300" simplePos="0" relativeHeight="251661312" behindDoc="0" locked="0" layoutInCell="1" hidden="0" allowOverlap="1" wp14:anchorId="457EB979" wp14:editId="69FA5274">
-                <wp:simplePos x="0" y="0"/>
-                <wp:positionH relativeFrom="column">
-                  <wp:posOffset>-12065</wp:posOffset>
-                </wp:positionH>
-                <wp:positionV relativeFrom="paragraph">
-                  <wp:posOffset>1130300</wp:posOffset>
-                </wp:positionV>
-                <wp:extent cx="6377940" cy="324000"/>
-                <wp:effectExtent l="0" t="0" r="0" b="0"/>
-                <wp:wrapSquare wrapText="bothSides" distT="0" distB="0" distL="114300" distR="114300"/>
-                <wp:docPr id="29" name="Rectángulo 29"/>
-                <wp:cNvGraphicFramePr/>
-                <a:graphic xmlns:a="http://schemas.openxmlformats.org/drawingml/2006/main">
-                  <a:graphicData uri="http://schemas.microsoft.com/office/word/2010/wordprocessingShape">
-                    <wps:wsp>
-                      <wps:cNvSpPr/>
-                      <wps:spPr>
-                        <a:xfrm>
-                          <a:off x="0" y="0"/>
-                          <a:ext cx="6377940" cy="324000"/>
-                        </a:xfrm>
-                        <a:prstGeom prst="rect">
-                          <a:avLst/>
-                        </a:prstGeom>
-                        <a:noFill/>
-                        <a:ln>
-                          <a:noFill/>
-                        </a:ln>
-                      </wps:spPr>
-                      <wps:txbx>
-                        <w:txbxContent>
-                          <w:p>
-                            <w:pPr>
-                              <w:textDirection w:val="btLr"/>
-                            </w:pPr>
-                            <w:r>
-                              <w:t>Sergio Jara Astete</w:t>
-                            </w:r>
-                          </w:p>
-                        </w:txbxContent>
-                      </wps:txbx>
-                      <wps:bodyPr spcFirstLastPara="1" wrap="square" lIns="91425" tIns="45700" rIns="91425" bIns="45700" anchor="t" anchorCtr="0">
-                        <a:noAutofit/>
-                      </wps:bodyPr>
-                    </wps:wsp>
-                  </a:graphicData>
-                </a:graphic>
-                <wp14:sizeRelV relativeFrom="margin">
-                  <wp14:pctHeight>0</wp14:pctHeight>
-                </wp14:sizeRelV>
-              </wp:anchor>
-            </w:drawing>
-          </mc:Choice>
-          <mc:Fallback>
-            <w:pict>
-              <v:rect w14:anchorId="457EB979" id="Rectángulo 29" o:spid="_x0000_s1028" style="position:absolute;margin-left:-.95pt;margin-top:89pt;width:502.2pt;height:25.5pt;z-index:251661312;visibility:visible;mso-wrap-style:square;mso-height-percent:0;mso-wrap-distance-left:9pt;mso-wrap-distance-top:0;mso-wrap-distance-right:9pt;mso-wrap-distance-bottom:0;mso-position-horizontal:absolute;mso-position-horizontal-relative:text;mso-position-vertical:absolute;mso-position-vertical-relative:text;mso-height-percent:0;mso-height-relative:margin;v-text-anchor:top" o:gfxdata="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" filled="f" stroked="f">
-                <v:textbox inset="2.53958mm,1.2694mm,2.53958mm,1.2694mm">
-                  <w:txbxContent>
-                    <w:p>
-                      <w:pPr>
-                        <w:textDirection w:val="btLr"/>
-                      </w:pPr>
-                      <w:r>
-                        <w:t>Sergio Jara Astete</w:t>
-                      </w:r>
-                    </w:p>
-                  </w:txbxContent>
-                </v:textbox>
-                <w10:wrap type="square"/>
-              </v:rect>
-            </w:pict>
-          </mc:Fallback>
-        </mc:AlternateContent>
-      </w:r>
-    </w:p>
-    <w:p>
-      <w:pPr>
+    </w:p>
+    <w:p>
+      <w:pPr>
+        <w:pBdr>
+          <w:top w:val="nil"/>
+          <w:left w:val="nil"/>
+          <w:bottom w:val="nil"/>
+          <w:right w:val="nil"/>
+          <w:between w:val="nil"/>
+        </w:pBdr>
         <w:rPr>
           <w:b/>
+          <w:color w:val="000000"/>
+          <w:sz w:val="20"/>
+          <w:szCs w:val="20"/>
+        </w:rPr>
+      </w:pPr>
+    </w:p>
+    <w:p>
+      <w:pPr>
+        <w:pBdr>
+          <w:top w:val="nil"/>
+          <w:left w:val="nil"/>
+          <w:bottom w:val="nil"/>
+          <w:right w:val="nil"/>
+          <w:between w:val="nil"/>
+        </w:pBdr>
+        <w:rPr>
+          <w:b/>
+          <w:color w:val="000000"/>
+          <w:sz w:val="20"/>
+          <w:szCs w:val="20"/>
+        </w:rPr>
+      </w:pPr>
+    </w:p>
+    <w:p>
+      <w:pPr>
+        <w:pBdr>
+          <w:top w:val="nil"/>
+          <w:left w:val="nil"/>
+          <w:bottom w:val="nil"/>
+          <w:right w:val="nil"/>
+          <w:between w:val="nil"/>
+        </w:pBdr>
+        <w:rPr>
+          <w:b/>
+          <w:color w:val="000000"/>
+          <w:sz w:val="20"/>
+          <w:szCs w:val="20"/>
+        </w:rPr>
+      </w:pPr>
+    </w:p>
+    <w:p>
+      <w:pPr>
+        <w:tabs>
+          <w:tab w:val="left" w:pos="2835"/>
+        </w:tabs>
+        <w:textDirection w:val="btLr"/>
+      </w:pPr>
+      <w:r>
+        <w:rPr>
+          <w:b/>
+          <w:bCs/>
+          <w:color w:val="231F20"/>
+          <w:szCs w:val="18"/>
+        </w:rPr>
+        <w:t>Nombres integrantes:</w:t>
+      </w:r>
+      <w:r>
+        <w:rPr>
+          <w:b/>
+          <w:bCs/>
+          <w:color w:val="231F20"/>
+          <w:szCs w:val="18"/>
+        </w:rPr>
+        <w:t xml:space="preserve"> </w:t>
+      </w:r>
+      <w:r>
+        <w:rPr>
+          <w:b/>
+          <w:bCs/>
+          <w:color w:val="231F20"/>
+          <w:szCs w:val="18"/>
+        </w:rPr>
+        <w:tab/>
+      </w:r>
+      <w:r>
+        <w:t>Fernando Flores Tobar</w:t>
+      </w:r>
+    </w:p>
+    <w:p>
+      <w:pPr>
+        <w:ind w:left="2835"/>
+        <w:textDirection w:val="btLr"/>
+      </w:pPr>
+      <w:r>
+        <w:t>Sergio Jara Astete</w:t>
+      </w:r>
+    </w:p>
+    <w:p>
+      <w:pPr>
+        <w:ind w:left="2835"/>
+        <w:textDirection w:val="btLr"/>
+      </w:pPr>
+      <w:r>
+        <w:t>Rodrigo Rivas Riffo</w:t>
+      </w:r>
+    </w:p>
+    <w:p>
+      <w:pPr>
+        <w:pBdr>
+          <w:top w:val="nil"/>
+          <w:left w:val="nil"/>
+          <w:bottom w:val="nil"/>
+          <w:right w:val="nil"/>
+          <w:between w:val="nil"/>
+        </w:pBdr>
+        <w:rPr>
+          <w:b/>
+          <w:color w:val="000000"/>
+          <w:sz w:val="20"/>
+          <w:szCs w:val="20"/>
+        </w:rPr>
+      </w:pPr>
+    </w:p>
+    <w:p>
+      <w:pPr>
+        <w:tabs>
+          <w:tab w:val="left" w:pos="2835"/>
+        </w:tabs>
+        <w:rPr>
+          <w:b/>
+          <w:bCs/>
+          <w:color w:val="231F20"/>
+          <w:szCs w:val="18"/>
+        </w:rPr>
+      </w:pPr>
+      <w:r>
+        <w:rPr>
+          <w:b/>
+          <w:bCs/>
+          <w:color w:val="231F20"/>
+          <w:szCs w:val="18"/>
+        </w:rPr>
+        <w:t>Fecha: 27/07/2026</w:t>
+      </w:r>
+    </w:p>
+    <w:p>
+      <w:pPr>
+        <w:pBdr>
+          <w:top w:val="nil"/>
+          <w:left w:val="nil"/>
+          <w:bottom w:val="nil"/>
+          <w:right w:val="nil"/>
+          <w:between w:val="nil"/>
+        </w:pBdr>
+        <w:rPr>
+          <w:b/>
+          <w:color w:val="000000"/>
+          <w:sz w:val="20"/>
+          <w:szCs w:val="20"/>
+        </w:rPr>
+      </w:pPr>
+    </w:p>
+    <w:p>
+      <w:pPr>
+        <w:pBdr>
+          <w:top w:val="nil"/>
+          <w:left w:val="nil"/>
+          <w:bottom w:val="nil"/>
+          <w:right w:val="nil"/>
+          <w:between w:val="nil"/>
+        </w:pBdr>
+        <w:rPr>
+          <w:b/>
+          <w:color w:val="000000"/>
+          <w:sz w:val="20"/>
+          <w:szCs w:val="20"/>
+        </w:rPr>
+      </w:pPr>
+    </w:p>
+    <w:p>
+      <w:pPr>
+        <w:pBdr>
+          <w:top w:val="nil"/>
+          <w:left w:val="nil"/>
+          <w:bottom w:val="nil"/>
+          <w:right w:val="nil"/>
+          <w:between w:val="nil"/>
+        </w:pBdr>
+        <w:rPr>
+          <w:b/>
+          <w:color w:val="000000"/>
+          <w:sz w:val="20"/>
+          <w:szCs w:val="20"/>
+        </w:rPr>
+      </w:pPr>
+    </w:p>
+    <w:p>
+      <w:pPr>
+        <w:rPr>
+          <w:b/>
         </w:rPr>
         <w:sectPr>
-          <w:headerReference w:type="default" r:id="rId10"/>
-          <w:footerReference w:type="default" r:id="rId11"/>
+          <w:headerReference w:type="default" r:id="rId9"/>
+          <w:footerReference w:type="default" r:id="rId10"/>
           <w:pgSz w:w="12240" w:h="15840"/>
           <w:pgMar w:top="420" w:right="1720" w:bottom="280" w:left="1020" w:header="720" w:footer="720" w:gutter="0"/>
           <w:pgNumType w:start="1"/>
@@ -806,94 +673,28 @@
         </w:sectPr>
       </w:pPr>
       <w:r>
-        <w:rPr>
-          <w:noProof/>
-        </w:rPr>
-        <mc:AlternateContent>
-          <mc:Choice Requires="wps">
-            <w:drawing>
-              <wp:anchor distT="0" distB="0" distL="114300" distR="114300" simplePos="0" relativeHeight="251665408" behindDoc="0" locked="0" layoutInCell="1" hidden="0" allowOverlap="1" wp14:anchorId="4FF826CD" wp14:editId="433A1484">
-                <wp:simplePos x="0" y="0"/>
-                <wp:positionH relativeFrom="column">
-                  <wp:posOffset>-9525</wp:posOffset>
-                </wp:positionH>
-                <wp:positionV relativeFrom="paragraph">
-                  <wp:posOffset>1320800</wp:posOffset>
-                </wp:positionV>
-                <wp:extent cx="6377940" cy="324000"/>
-                <wp:effectExtent l="0" t="0" r="0" b="0"/>
-                <wp:wrapSquare wrapText="bothSides" distT="0" distB="0" distL="114300" distR="114300"/>
-                <wp:docPr id="817738941" name="Rectángulo 817738941"/>
-                <wp:cNvGraphicFramePr/>
-                <a:graphic xmlns:a="http://schemas.openxmlformats.org/drawingml/2006/main">
-                  <a:graphicData uri="http://schemas.microsoft.com/office/word/2010/wordprocessingShape">
-                    <wps:wsp>
-                      <wps:cNvSpPr/>
-                      <wps:spPr>
-                        <a:xfrm>
-                          <a:off x="0" y="0"/>
-                          <a:ext cx="6377940" cy="324000"/>
-                        </a:xfrm>
-                        <a:prstGeom prst="rect">
-                          <a:avLst/>
-                        </a:prstGeom>
-                        <a:noFill/>
-                        <a:ln>
-                          <a:noFill/>
-                        </a:ln>
-                      </wps:spPr>
-                      <wps:txbx>
-                        <w:txbxContent>
-                          <w:p>
-                            <w:pPr>
-                              <w:textDirection w:val="btLr"/>
-                            </w:pPr>
-                            <w:r>
-                              <w:t>Rodrigo Rivas Riffo</w:t>
-                            </w:r>
-                          </w:p>
-                        </w:txbxContent>
-                      </wps:txbx>
-                      <wps:bodyPr spcFirstLastPara="1" wrap="square" lIns="91425" tIns="45700" rIns="91425" bIns="45700" anchor="t" anchorCtr="0">
-                        <a:noAutofit/>
-                      </wps:bodyPr>
-                    </wps:wsp>
-                  </a:graphicData>
-                </a:graphic>
-                <wp14:sizeRelV relativeFrom="margin">
-                  <wp14:pctHeight>0</wp14:pctHeight>
-                </wp14:sizeRelV>
-              </wp:anchor>
-            </w:drawing>
-          </mc:Choice>
-          <mc:Fallback>
-            <w:pict>
-              <v:rect w14:anchorId="4FF826CD" id="Rectángulo 817738941" o:spid="_x0000_s1029" style="position:absolute;margin-left:-.75pt;margin-top:104pt;width:502.2pt;height:25.5pt;z-index:251665408;visibility:visible;mso-wrap-style:square;mso-height-percent:0;mso-wrap-distance-left:9pt;mso-wrap-distance-top:0;mso-wrap-distance-right:9pt;mso-wrap-distance-bottom:0;mso-position-horizontal:absolute;mso-position-horizontal-relative:text;mso-position-vertical:absolute;mso-position-vertical-relative:text;mso-height-percent:0;mso-height-relative:margin;v-text-anchor:top" o:gfxdata="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" filled="f" stroked="f">
-                <v:textbox inset="2.53958mm,1.2694mm,2.53958mm,1.2694mm">
-                  <w:txbxContent>
-                    <w:p>
-                      <w:pPr>
-                        <w:textDirection w:val="btLr"/>
-                      </w:pPr>
-                      <w:r>
-                        <w:t>Rodrigo Rivas Riffo</w:t>
-                      </w:r>
-                    </w:p>
-                  </w:txbxContent>
-                </v:textbox>
-                <w10:wrap type="square"/>
-              </v:rect>
-            </w:pict>
-          </mc:Fallback>
-        </mc:AlternateContent>
-      </w:r>
-      <w:r>
         <w:br w:type="page"/>
       </w:r>
     </w:p>
     <w:p>
       <w:pPr>
-        <w:spacing w:after="160" w:line="276" w:lineRule="auto"/>
+        <w:contextualSpacing/>
+        <w:rPr>
+          <w:b/>
+        </w:rPr>
+      </w:pPr>
+    </w:p>
+    <w:p>
+      <w:pPr>
+        <w:contextualSpacing/>
+        <w:rPr>
+          <w:b/>
+        </w:rPr>
+      </w:pPr>
+    </w:p>
+    <w:p>
+      <w:pPr>
+        <w:spacing w:after="160"/>
       </w:pPr>
       <w:r>
         <w:rPr>
@@ -902,6 +703,707 @@
         </w:rPr>
         <w:t>Índice</w:t>
       </w:r>
+    </w:p>
+    <w:p>
+      <w:pPr>
+        <w:pStyle w:val="TDC1"/>
+        <w:tabs>
+          <w:tab w:val="left" w:pos="480"/>
+          <w:tab w:val="right" w:leader="dot" w:pos="9350"/>
+        </w:tabs>
+        <w:rPr>
+          <w:rFonts w:asciiTheme="minorHAnsi" w:eastAsiaTheme="minorEastAsia" w:hAnsiTheme="minorHAnsi" w:cstheme="minorBidi"/>
+          <w:noProof/>
+          <w:kern w:val="2"/>
+          <w:sz w:val="24"/>
+          <w:szCs w:val="24"/>
+          <w:lang w:eastAsia="es-CL" w:bidi="ar-SA"/>
+          <w14:ligatures w14:val="standardContextual"/>
+        </w:rPr>
+      </w:pPr>
+      <w:r>
+        <w:fldChar w:fldCharType="begin"/>
+      </w:r>
+      <w:r>
+        <w:instrText>TOC \o "1-2" \h \z \u</w:instrText>
+      </w:r>
+      <w:r>
+        <w:fldChar w:fldCharType="separate"/>
+      </w:r>
+      <w:hyperlink w:anchor="_Toc236040762" w:history="1">
+        <w:r>
+          <w:rPr>
+            <w:rStyle w:val="Hipervnculo"/>
+            <w:noProof/>
+          </w:rPr>
+          <w:t>1.</w:t>
+        </w:r>
+        <w:r>
+          <w:rPr>
+            <w:rFonts w:asciiTheme="minorHAnsi" w:eastAsiaTheme="minorEastAsia" w:hAnsiTheme="minorHAnsi" w:cstheme="minorBidi"/>
+            <w:noProof/>
+            <w:kern w:val="2"/>
+            <w:sz w:val="24"/>
+            <w:szCs w:val="24"/>
+            <w:lang w:eastAsia="es-CL" w:bidi="ar-SA"/>
+            <w14:ligatures w14:val="standardContextual"/>
+          </w:rPr>
+          <w:tab/>
+        </w:r>
+        <w:r>
+          <w:rPr>
+            <w:rStyle w:val="Hipervnculo"/>
+            <w:noProof/>
+          </w:rPr>
+          <w:t>Introducción</w:t>
+        </w:r>
+        <w:r>
+          <w:rPr>
+            <w:noProof/>
+            <w:webHidden/>
+          </w:rPr>
+          <w:tab/>
+        </w:r>
+        <w:r>
+          <w:rPr>
+            <w:noProof/>
+            <w:webHidden/>
+          </w:rPr>
+          <w:fldChar w:fldCharType="begin"/>
+        </w:r>
+        <w:r>
+          <w:rPr>
+            <w:noProof/>
+            <w:webHidden/>
+          </w:rPr>
+          <w:instrText xml:space="preserve"> PAGEREF _Toc236040762 \h </w:instrText>
+        </w:r>
+        <w:r>
+          <w:rPr>
+            <w:noProof/>
+            <w:webHidden/>
+          </w:rPr>
+        </w:r>
+        <w:r>
+          <w:rPr>
+            <w:noProof/>
+            <w:webHidden/>
+          </w:rPr>
+          <w:fldChar w:fldCharType="separate"/>
+        </w:r>
+        <w:r>
+          <w:rPr>
+            <w:noProof/>
+            <w:webHidden/>
+          </w:rPr>
+          <w:t>3</w:t>
+        </w:r>
+        <w:r>
+          <w:rPr>
+            <w:noProof/>
+            <w:webHidden/>
+          </w:rPr>
+          <w:fldChar w:fldCharType="end"/>
+        </w:r>
+      </w:hyperlink>
+    </w:p>
+    <w:p>
+      <w:pPr>
+        <w:pStyle w:val="TDC1"/>
+        <w:tabs>
+          <w:tab w:val="left" w:pos="480"/>
+          <w:tab w:val="right" w:leader="dot" w:pos="9350"/>
+        </w:tabs>
+        <w:rPr>
+          <w:rFonts w:asciiTheme="minorHAnsi" w:eastAsiaTheme="minorEastAsia" w:hAnsiTheme="minorHAnsi" w:cstheme="minorBidi"/>
+          <w:noProof/>
+          <w:kern w:val="2"/>
+          <w:sz w:val="24"/>
+          <w:szCs w:val="24"/>
+          <w:lang w:eastAsia="es-CL" w:bidi="ar-SA"/>
+          <w14:ligatures w14:val="standardContextual"/>
+        </w:rPr>
+      </w:pPr>
+      <w:hyperlink w:anchor="_Toc236040763" w:history="1">
+        <w:r>
+          <w:rPr>
+            <w:rStyle w:val="Hipervnculo"/>
+            <w:noProof/>
+          </w:rPr>
+          <w:t>2.</w:t>
+        </w:r>
+        <w:r>
+          <w:rPr>
+            <w:rFonts w:asciiTheme="minorHAnsi" w:eastAsiaTheme="minorEastAsia" w:hAnsiTheme="minorHAnsi" w:cstheme="minorBidi"/>
+            <w:noProof/>
+            <w:kern w:val="2"/>
+            <w:sz w:val="24"/>
+            <w:szCs w:val="24"/>
+            <w:lang w:eastAsia="es-CL" w:bidi="ar-SA"/>
+            <w14:ligatures w14:val="standardContextual"/>
+          </w:rPr>
+          <w:tab/>
+        </w:r>
+        <w:r>
+          <w:rPr>
+            <w:rStyle w:val="Hipervnculo"/>
+            <w:noProof/>
+          </w:rPr>
+          <w:t>Recordatorio de la propuesta (StockControl)</w:t>
+        </w:r>
+        <w:r>
+          <w:rPr>
+            <w:noProof/>
+            <w:webHidden/>
+          </w:rPr>
+          <w:tab/>
+        </w:r>
+        <w:r>
+          <w:rPr>
+            <w:noProof/>
+            <w:webHidden/>
+          </w:rPr>
+          <w:fldChar w:fldCharType="begin"/>
+        </w:r>
+        <w:r>
+          <w:rPr>
+            <w:noProof/>
+            <w:webHidden/>
+          </w:rPr>
+          <w:instrText xml:space="preserve"> PAGEREF _Toc236040763 \h </w:instrText>
+        </w:r>
+        <w:r>
+          <w:rPr>
+            <w:noProof/>
+            <w:webHidden/>
+          </w:rPr>
+        </w:r>
+        <w:r>
+          <w:rPr>
+            <w:noProof/>
+            <w:webHidden/>
+          </w:rPr>
+          <w:fldChar w:fldCharType="separate"/>
+        </w:r>
+        <w:r>
+          <w:rPr>
+            <w:noProof/>
+            <w:webHidden/>
+          </w:rPr>
+          <w:t>3</w:t>
+        </w:r>
+        <w:r>
+          <w:rPr>
+            <w:noProof/>
+            <w:webHidden/>
+          </w:rPr>
+          <w:fldChar w:fldCharType="end"/>
+        </w:r>
+      </w:hyperlink>
+    </w:p>
+    <w:p>
+      <w:pPr>
+        <w:pStyle w:val="TDC1"/>
+        <w:tabs>
+          <w:tab w:val="left" w:pos="480"/>
+          <w:tab w:val="right" w:leader="dot" w:pos="9350"/>
+        </w:tabs>
+        <w:rPr>
+          <w:rFonts w:asciiTheme="minorHAnsi" w:eastAsiaTheme="minorEastAsia" w:hAnsiTheme="minorHAnsi" w:cstheme="minorBidi"/>
+          <w:noProof/>
+          <w:kern w:val="2"/>
+          <w:sz w:val="24"/>
+          <w:szCs w:val="24"/>
+          <w:lang w:eastAsia="es-CL" w:bidi="ar-SA"/>
+          <w14:ligatures w14:val="standardContextual"/>
+        </w:rPr>
+      </w:pPr>
+      <w:hyperlink w:anchor="_Toc236040764" w:history="1">
+        <w:r>
+          <w:rPr>
+            <w:rStyle w:val="Hipervnculo"/>
+            <w:noProof/>
+          </w:rPr>
+          <w:t>3.</w:t>
+        </w:r>
+        <w:r>
+          <w:rPr>
+            <w:rFonts w:asciiTheme="minorHAnsi" w:eastAsiaTheme="minorEastAsia" w:hAnsiTheme="minorHAnsi" w:cstheme="minorBidi"/>
+            <w:noProof/>
+            <w:kern w:val="2"/>
+            <w:sz w:val="24"/>
+            <w:szCs w:val="24"/>
+            <w:lang w:eastAsia="es-CL" w:bidi="ar-SA"/>
+            <w14:ligatures w14:val="standardContextual"/>
+          </w:rPr>
+          <w:tab/>
+        </w:r>
+        <w:r>
+          <w:rPr>
+            <w:rStyle w:val="Hipervnculo"/>
+            <w:noProof/>
+          </w:rPr>
+          <w:t>Adaptación del CRUD de ejemplo a StockControl</w:t>
+        </w:r>
+        <w:r>
+          <w:rPr>
+            <w:noProof/>
+            <w:webHidden/>
+          </w:rPr>
+          <w:tab/>
+        </w:r>
+        <w:r>
+          <w:rPr>
+            <w:noProof/>
+            <w:webHidden/>
+          </w:rPr>
+          <w:fldChar w:fldCharType="begin"/>
+        </w:r>
+        <w:r>
+          <w:rPr>
+            <w:noProof/>
+            <w:webHidden/>
+          </w:rPr>
+          <w:instrText xml:space="preserve"> PAGEREF _Toc236040764 \h </w:instrText>
+        </w:r>
+        <w:r>
+          <w:rPr>
+            <w:noProof/>
+            <w:webHidden/>
+          </w:rPr>
+        </w:r>
+        <w:r>
+          <w:rPr>
+            <w:noProof/>
+            <w:webHidden/>
+          </w:rPr>
+          <w:fldChar w:fldCharType="separate"/>
+        </w:r>
+        <w:r>
+          <w:rPr>
+            <w:noProof/>
+            <w:webHidden/>
+          </w:rPr>
+          <w:t>3</w:t>
+        </w:r>
+        <w:r>
+          <w:rPr>
+            <w:noProof/>
+            <w:webHidden/>
+          </w:rPr>
+          <w:fldChar w:fldCharType="end"/>
+        </w:r>
+      </w:hyperlink>
+    </w:p>
+    <w:p>
+      <w:pPr>
+        <w:pStyle w:val="TDC2"/>
+        <w:tabs>
+          <w:tab w:val="right" w:leader="dot" w:pos="9350"/>
+        </w:tabs>
+        <w:rPr>
+          <w:rFonts w:asciiTheme="minorHAnsi" w:eastAsiaTheme="minorEastAsia" w:hAnsiTheme="minorHAnsi" w:cstheme="minorBidi"/>
+          <w:noProof/>
+          <w:kern w:val="2"/>
+          <w:sz w:val="24"/>
+          <w:szCs w:val="24"/>
+          <w:lang w:eastAsia="es-CL" w:bidi="ar-SA"/>
+          <w14:ligatures w14:val="standardContextual"/>
+        </w:rPr>
+      </w:pPr>
+      <w:hyperlink w:anchor="_Toc236040765" w:history="1">
+        <w:r>
+          <w:rPr>
+            <w:rStyle w:val="Hipervnculo"/>
+            <w:noProof/>
+          </w:rPr>
+          <w:t>3.1 Modelos</w:t>
+        </w:r>
+        <w:r>
+          <w:rPr>
+            <w:noProof/>
+            <w:webHidden/>
+          </w:rPr>
+          <w:tab/>
+        </w:r>
+        <w:r>
+          <w:rPr>
+            <w:noProof/>
+            <w:webHidden/>
+          </w:rPr>
+          <w:fldChar w:fldCharType="begin"/>
+        </w:r>
+        <w:r>
+          <w:rPr>
+            <w:noProof/>
+            <w:webHidden/>
+          </w:rPr>
+          <w:instrText xml:space="preserve"> PAGEREF _Toc236040765 \h </w:instrText>
+        </w:r>
+        <w:r>
+          <w:rPr>
+            <w:noProof/>
+            <w:webHidden/>
+          </w:rPr>
+        </w:r>
+        <w:r>
+          <w:rPr>
+            <w:noProof/>
+            <w:webHidden/>
+          </w:rPr>
+          <w:fldChar w:fldCharType="separate"/>
+        </w:r>
+        <w:r>
+          <w:rPr>
+            <w:noProof/>
+            <w:webHidden/>
+          </w:rPr>
+          <w:t>4</w:t>
+        </w:r>
+        <w:r>
+          <w:rPr>
+            <w:noProof/>
+            <w:webHidden/>
+          </w:rPr>
+          <w:fldChar w:fldCharType="end"/>
+        </w:r>
+      </w:hyperlink>
+    </w:p>
+    <w:p>
+      <w:pPr>
+        <w:pStyle w:val="TDC2"/>
+        <w:tabs>
+          <w:tab w:val="right" w:leader="dot" w:pos="9350"/>
+        </w:tabs>
+        <w:rPr>
+          <w:rFonts w:asciiTheme="minorHAnsi" w:eastAsiaTheme="minorEastAsia" w:hAnsiTheme="minorHAnsi" w:cstheme="minorBidi"/>
+          <w:noProof/>
+          <w:kern w:val="2"/>
+          <w:sz w:val="24"/>
+          <w:szCs w:val="24"/>
+          <w:lang w:eastAsia="es-CL" w:bidi="ar-SA"/>
+          <w14:ligatures w14:val="standardContextual"/>
+        </w:rPr>
+      </w:pPr>
+      <w:hyperlink w:anchor="_Toc236040766" w:history="1">
+        <w:r>
+          <w:rPr>
+            <w:rStyle w:val="Hipervnculo"/>
+            <w:noProof/>
+          </w:rPr>
+          <w:t>3.2 Vistas y URLs</w:t>
+        </w:r>
+        <w:r>
+          <w:rPr>
+            <w:noProof/>
+            <w:webHidden/>
+          </w:rPr>
+          <w:tab/>
+        </w:r>
+        <w:r>
+          <w:rPr>
+            <w:noProof/>
+            <w:webHidden/>
+          </w:rPr>
+          <w:fldChar w:fldCharType="begin"/>
+        </w:r>
+        <w:r>
+          <w:rPr>
+            <w:noProof/>
+            <w:webHidden/>
+          </w:rPr>
+          <w:instrText xml:space="preserve"> PAGEREF _Toc236040766 \h </w:instrText>
+        </w:r>
+        <w:r>
+          <w:rPr>
+            <w:noProof/>
+            <w:webHidden/>
+          </w:rPr>
+        </w:r>
+        <w:r>
+          <w:rPr>
+            <w:noProof/>
+            <w:webHidden/>
+          </w:rPr>
+          <w:fldChar w:fldCharType="separate"/>
+        </w:r>
+        <w:r>
+          <w:rPr>
+            <w:noProof/>
+            <w:webHidden/>
+          </w:rPr>
+          <w:t>4</w:t>
+        </w:r>
+        <w:r>
+          <w:rPr>
+            <w:noProof/>
+            <w:webHidden/>
+          </w:rPr>
+          <w:fldChar w:fldCharType="end"/>
+        </w:r>
+      </w:hyperlink>
+    </w:p>
+    <w:p>
+      <w:pPr>
+        <w:pStyle w:val="TDC2"/>
+        <w:tabs>
+          <w:tab w:val="right" w:leader="dot" w:pos="9350"/>
+        </w:tabs>
+        <w:rPr>
+          <w:rFonts w:asciiTheme="minorHAnsi" w:eastAsiaTheme="minorEastAsia" w:hAnsiTheme="minorHAnsi" w:cstheme="minorBidi"/>
+          <w:noProof/>
+          <w:kern w:val="2"/>
+          <w:sz w:val="24"/>
+          <w:szCs w:val="24"/>
+          <w:lang w:eastAsia="es-CL" w:bidi="ar-SA"/>
+          <w14:ligatures w14:val="standardContextual"/>
+        </w:rPr>
+      </w:pPr>
+      <w:hyperlink w:anchor="_Toc236040767" w:history="1">
+        <w:r>
+          <w:rPr>
+            <w:rStyle w:val="Hipervnculo"/>
+            <w:noProof/>
+          </w:rPr>
+          <w:t>3.3 Plantillas y configuración</w:t>
+        </w:r>
+        <w:r>
+          <w:rPr>
+            <w:noProof/>
+            <w:webHidden/>
+          </w:rPr>
+          <w:tab/>
+        </w:r>
+        <w:r>
+          <w:rPr>
+            <w:noProof/>
+            <w:webHidden/>
+          </w:rPr>
+          <w:fldChar w:fldCharType="begin"/>
+        </w:r>
+        <w:r>
+          <w:rPr>
+            <w:noProof/>
+            <w:webHidden/>
+          </w:rPr>
+          <w:instrText xml:space="preserve"> PAGEREF _Toc236040767 \h </w:instrText>
+        </w:r>
+        <w:r>
+          <w:rPr>
+            <w:noProof/>
+            <w:webHidden/>
+          </w:rPr>
+        </w:r>
+        <w:r>
+          <w:rPr>
+            <w:noProof/>
+            <w:webHidden/>
+          </w:rPr>
+          <w:fldChar w:fldCharType="separate"/>
+        </w:r>
+        <w:r>
+          <w:rPr>
+            <w:noProof/>
+            <w:webHidden/>
+          </w:rPr>
+          <w:t>5</w:t>
+        </w:r>
+        <w:r>
+          <w:rPr>
+            <w:noProof/>
+            <w:webHidden/>
+          </w:rPr>
+          <w:fldChar w:fldCharType="end"/>
+        </w:r>
+      </w:hyperlink>
+    </w:p>
+    <w:p>
+      <w:pPr>
+        <w:pStyle w:val="TDC1"/>
+        <w:tabs>
+          <w:tab w:val="left" w:pos="480"/>
+          <w:tab w:val="right" w:leader="dot" w:pos="9350"/>
+        </w:tabs>
+        <w:rPr>
+          <w:rFonts w:asciiTheme="minorHAnsi" w:eastAsiaTheme="minorEastAsia" w:hAnsiTheme="minorHAnsi" w:cstheme="minorBidi"/>
+          <w:noProof/>
+          <w:kern w:val="2"/>
+          <w:sz w:val="24"/>
+          <w:szCs w:val="24"/>
+          <w:lang w:eastAsia="es-CL" w:bidi="ar-SA"/>
+          <w14:ligatures w14:val="standardContextual"/>
+        </w:rPr>
+      </w:pPr>
+      <w:hyperlink w:anchor="_Toc236040768" w:history="1">
+        <w:r>
+          <w:rPr>
+            <w:rStyle w:val="Hipervnculo"/>
+            <w:noProof/>
+          </w:rPr>
+          <w:t>4.</w:t>
+        </w:r>
+        <w:r>
+          <w:rPr>
+            <w:rFonts w:asciiTheme="minorHAnsi" w:eastAsiaTheme="minorEastAsia" w:hAnsiTheme="minorHAnsi" w:cstheme="minorBidi"/>
+            <w:noProof/>
+            <w:kern w:val="2"/>
+            <w:sz w:val="24"/>
+            <w:szCs w:val="24"/>
+            <w:lang w:eastAsia="es-CL" w:bidi="ar-SA"/>
+            <w14:ligatures w14:val="standardContextual"/>
+          </w:rPr>
+          <w:tab/>
+        </w:r>
+        <w:r>
+          <w:rPr>
+            <w:rStyle w:val="Hipervnculo"/>
+            <w:noProof/>
+          </w:rPr>
+          <w:t>Buenas prácticas en el diseño</w:t>
+        </w:r>
+        <w:r>
+          <w:rPr>
+            <w:noProof/>
+            <w:webHidden/>
+          </w:rPr>
+          <w:tab/>
+        </w:r>
+        <w:r>
+          <w:rPr>
+            <w:noProof/>
+            <w:webHidden/>
+          </w:rPr>
+          <w:fldChar w:fldCharType="begin"/>
+        </w:r>
+        <w:r>
+          <w:rPr>
+            <w:noProof/>
+            <w:webHidden/>
+          </w:rPr>
+          <w:instrText xml:space="preserve"> PAGEREF _Toc236040768 \h </w:instrText>
+        </w:r>
+        <w:r>
+          <w:rPr>
+            <w:noProof/>
+            <w:webHidden/>
+          </w:rPr>
+        </w:r>
+        <w:r>
+          <w:rPr>
+            <w:noProof/>
+            <w:webHidden/>
+          </w:rPr>
+          <w:fldChar w:fldCharType="separate"/>
+        </w:r>
+        <w:r>
+          <w:rPr>
+            <w:noProof/>
+            <w:webHidden/>
+          </w:rPr>
+          <w:t>5</w:t>
+        </w:r>
+        <w:r>
+          <w:rPr>
+            <w:noProof/>
+            <w:webHidden/>
+          </w:rPr>
+          <w:fldChar w:fldCharType="end"/>
+        </w:r>
+      </w:hyperlink>
+    </w:p>
+    <w:p>
+      <w:pPr>
+        <w:pStyle w:val="TDC1"/>
+        <w:tabs>
+          <w:tab w:val="left" w:pos="480"/>
+          <w:tab w:val="right" w:leader="dot" w:pos="9350"/>
+        </w:tabs>
+        <w:rPr>
+          <w:rFonts w:asciiTheme="minorHAnsi" w:eastAsiaTheme="minorEastAsia" w:hAnsiTheme="minorHAnsi" w:cstheme="minorBidi"/>
+          <w:noProof/>
+          <w:kern w:val="2"/>
+          <w:sz w:val="24"/>
+          <w:szCs w:val="24"/>
+          <w:lang w:eastAsia="es-CL" w:bidi="ar-SA"/>
+          <w14:ligatures w14:val="standardContextual"/>
+        </w:rPr>
+      </w:pPr>
+      <w:hyperlink w:anchor="_Toc236040769" w:history="1">
+        <w:r>
+          <w:rPr>
+            <w:rStyle w:val="Hipervnculo"/>
+            <w:noProof/>
+          </w:rPr>
+          <w:t>5.</w:t>
+        </w:r>
+        <w:r>
+          <w:rPr>
+            <w:rFonts w:asciiTheme="minorHAnsi" w:eastAsiaTheme="minorEastAsia" w:hAnsiTheme="minorHAnsi" w:cstheme="minorBidi"/>
+            <w:noProof/>
+            <w:kern w:val="2"/>
+            <w:sz w:val="24"/>
+            <w:szCs w:val="24"/>
+            <w:lang w:eastAsia="es-CL" w:bidi="ar-SA"/>
+            <w14:ligatures w14:val="standardContextual"/>
+          </w:rPr>
+          <w:tab/>
+        </w:r>
+        <w:r>
+          <w:rPr>
+            <w:rStyle w:val="Hipervnculo"/>
+            <w:noProof/>
+          </w:rPr>
+          <w:t>CRUD mínimo viable y despliegue local</w:t>
+        </w:r>
+        <w:r>
+          <w:rPr>
+            <w:noProof/>
+            <w:webHidden/>
+          </w:rPr>
+          <w:tab/>
+        </w:r>
+        <w:r>
+          <w:rPr>
+            <w:noProof/>
+            <w:webHidden/>
+          </w:rPr>
+          <w:fldChar w:fldCharType="begin"/>
+        </w:r>
+        <w:r>
+          <w:rPr>
+            <w:noProof/>
+            <w:webHidden/>
+          </w:rPr>
+          <w:instrText xml:space="preserve"> PAGEREF _Toc236040769 \h </w:instrText>
+        </w:r>
+        <w:r>
+          <w:rPr>
+            <w:noProof/>
+            <w:webHidden/>
+          </w:rPr>
+        </w:r>
+        <w:r>
+          <w:rPr>
+            <w:noProof/>
+            <w:webHidden/>
+          </w:rPr>
+          <w:fldChar w:fldCharType="separate"/>
+        </w:r>
+        <w:r>
+          <w:rPr>
+            <w:noProof/>
+            <w:webHidden/>
+          </w:rPr>
+          <w:t>5</w:t>
+        </w:r>
+        <w:r>
+          <w:rPr>
+            <w:noProof/>
+            <w:webHidden/>
+          </w:rPr>
+          <w:fldChar w:fldCharType="end"/>
+        </w:r>
+      </w:hyperlink>
     </w:p>
     <w:p>
       <w:pPr>
@@ -909,61 +1411,68 @@
         <w:tabs>
           <w:tab w:val="right" w:leader="dot" w:pos="9350"/>
         </w:tabs>
-        <w:spacing w:line="276" w:lineRule="auto"/>
-      </w:pPr>
-      <w:r>
-        <w:fldChar w:fldCharType="begin"/>
-      </w:r>
-      <w:r>
-        <w:instrText>TOC \o "1-2" \h \z \u</w:instrText>
-      </w:r>
-      <w:r>
-        <w:fldChar w:fldCharType="separate"/>
-      </w:r>
-      <w:hyperlink w:anchor="_Toc235737949" w:history="1">
+        <w:rPr>
+          <w:rFonts w:asciiTheme="minorHAnsi" w:eastAsiaTheme="minorEastAsia" w:hAnsiTheme="minorHAnsi" w:cstheme="minorBidi"/>
+          <w:noProof/>
+          <w:kern w:val="2"/>
+          <w:sz w:val="24"/>
+          <w:szCs w:val="24"/>
+          <w:lang w:eastAsia="es-CL" w:bidi="ar-SA"/>
+          <w14:ligatures w14:val="standardContextual"/>
+        </w:rPr>
+      </w:pPr>
+      <w:hyperlink w:anchor="_Toc236040770" w:history="1">
         <w:r>
           <w:rPr>
             <w:rStyle w:val="Hipervnculo"/>
-          </w:rPr>
-          <w:t>1. Introduccion</w:t>
-        </w:r>
-        <w:r>
-          <w:rPr>
+            <w:noProof/>
+          </w:rPr>
+          <w:t>6. Conclusiones</w:t>
+        </w:r>
+        <w:r>
+          <w:rPr>
+            <w:noProof/>
             <w:webHidden/>
           </w:rPr>
           <w:tab/>
         </w:r>
         <w:r>
           <w:rPr>
+            <w:noProof/>
             <w:webHidden/>
           </w:rPr>
           <w:fldChar w:fldCharType="begin"/>
         </w:r>
         <w:r>
           <w:rPr>
+            <w:noProof/>
             <w:webHidden/>
           </w:rPr>
-          <w:instrText xml:space="preserve"> PAGEREF _Toc235737949 \h </w:instrText>
-        </w:r>
-        <w:r>
-          <w:rPr>
+          <w:instrText xml:space="preserve"> PAGEREF _Toc236040770 \h </w:instrText>
+        </w:r>
+        <w:r>
+          <w:rPr>
+            <w:noProof/>
             <w:webHidden/>
           </w:rPr>
         </w:r>
         <w:r>
           <w:rPr>
+            <w:noProof/>
             <w:webHidden/>
           </w:rPr>
           <w:fldChar w:fldCharType="separate"/>
         </w:r>
         <w:r>
           <w:rPr>
+            <w:noProof/>
             <w:webHidden/>
           </w:rPr>
-          <w:t>3</w:t>
-        </w:r>
-        <w:r>
-          <w:rPr>
+          <w:t>6</w:t>
+        </w:r>
+        <w:r>
+          <w:rPr>
+            <w:noProof/>
             <w:webHidden/>
           </w:rPr>
           <w:fldChar w:fldCharType="end"/>
@@ -976,52 +1485,68 @@
         <w:tabs>
           <w:tab w:val="right" w:leader="dot" w:pos="9350"/>
         </w:tabs>
-        <w:spacing w:line="276" w:lineRule="auto"/>
-      </w:pPr>
-      <w:hyperlink w:anchor="_Toc235737950" w:history="1">
+        <w:rPr>
+          <w:rFonts w:asciiTheme="minorHAnsi" w:eastAsiaTheme="minorEastAsia" w:hAnsiTheme="minorHAnsi" w:cstheme="minorBidi"/>
+          <w:noProof/>
+          <w:kern w:val="2"/>
+          <w:sz w:val="24"/>
+          <w:szCs w:val="24"/>
+          <w:lang w:eastAsia="es-CL" w:bidi="ar-SA"/>
+          <w14:ligatures w14:val="standardContextual"/>
+        </w:rPr>
+      </w:pPr>
+      <w:hyperlink w:anchor="_Toc236040771" w:history="1">
         <w:r>
           <w:rPr>
             <w:rStyle w:val="Hipervnculo"/>
-          </w:rPr>
-          <w:t>2. Recordatorio de la propuesta (StockControl)</w:t>
-        </w:r>
-        <w:r>
-          <w:rPr>
+            <w:noProof/>
+          </w:rPr>
+          <w:t>7. Referencias</w:t>
+        </w:r>
+        <w:r>
+          <w:rPr>
+            <w:noProof/>
             <w:webHidden/>
           </w:rPr>
           <w:tab/>
         </w:r>
         <w:r>
           <w:rPr>
+            <w:noProof/>
             <w:webHidden/>
           </w:rPr>
           <w:fldChar w:fldCharType="begin"/>
         </w:r>
         <w:r>
           <w:rPr>
+            <w:noProof/>
             <w:webHidden/>
           </w:rPr>
-          <w:instrText xml:space="preserve"> PAGEREF _Toc235737950 \h </w:instrText>
-        </w:r>
-        <w:r>
-          <w:rPr>
+          <w:instrText xml:space="preserve"> PAGEREF _Toc236040771 \h </w:instrText>
+        </w:r>
+        <w:r>
+          <w:rPr>
+            <w:noProof/>
             <w:webHidden/>
           </w:rPr>
         </w:r>
         <w:r>
           <w:rPr>
+            <w:noProof/>
             <w:webHidden/>
           </w:rPr>
           <w:fldChar w:fldCharType="separate"/>
         </w:r>
         <w:r>
           <w:rPr>
+            <w:noProof/>
             <w:webHidden/>
           </w:rPr>
-          <w:t>3</w:t>
-        </w:r>
-        <w:r>
-          <w:rPr>
+          <w:t>7</w:t>
+        </w:r>
+        <w:r>
+          <w:rPr>
+            <w:noProof/>
             <w:webHidden/>
           </w:rPr>
           <w:fldChar w:fldCharType="end"/>
@@ -1030,480 +1555,13 @@
     </w:p>
     <w:p>
       <w:pPr>
-        <w:pStyle w:val="TDC1"/>
-        <w:tabs>
-          <w:tab w:val="right" w:leader="dot" w:pos="9350"/>
-        </w:tabs>
-        <w:spacing w:line="276" w:lineRule="auto"/>
-      </w:pPr>
-      <w:hyperlink w:anchor="_Toc235737951" w:history="1">
-        <w:r>
-          <w:rPr>
-            <w:rStyle w:val="Hipervnculo"/>
-          </w:rPr>
-          <w:t>3. Adaptacion del CRUD de ejemplo a StockControl</w:t>
-        </w:r>
-        <w:r>
-          <w:rPr>
-            <w:webHidden/>
-          </w:rPr>
-          <w:tab/>
-        </w:r>
-        <w:r>
-          <w:rPr>
-            <w:webHidden/>
-          </w:rPr>
-          <w:fldChar w:fldCharType="begin"/>
-        </w:r>
-        <w:r>
-          <w:rPr>
-            <w:webHidden/>
-          </w:rPr>
-          <w:instrText xml:space="preserve"> PAGEREF _Toc235737951 \h </w:instrText>
-        </w:r>
-        <w:r>
-          <w:rPr>
-            <w:webHidden/>
-          </w:rPr>
-        </w:r>
-        <w:r>
-          <w:rPr>
-            <w:webHidden/>
-          </w:rPr>
-          <w:fldChar w:fldCharType="separate"/>
-        </w:r>
-        <w:r>
-          <w:rPr>
-            <w:webHidden/>
-          </w:rPr>
-          <w:t>3</w:t>
-        </w:r>
-        <w:r>
-          <w:rPr>
-            <w:webHidden/>
-          </w:rPr>
-          <w:fldChar w:fldCharType="end"/>
-        </w:r>
-      </w:hyperlink>
-    </w:p>
-    <w:p>
-      <w:pPr>
-        <w:pStyle w:val="TDC2"/>
-        <w:tabs>
-          <w:tab w:val="right" w:leader="dot" w:pos="9350"/>
-        </w:tabs>
-        <w:spacing w:line="276" w:lineRule="auto"/>
-      </w:pPr>
-      <w:hyperlink w:anchor="_Toc235737952" w:history="1">
-        <w:r>
-          <w:rPr>
-            <w:rStyle w:val="Hipervnculo"/>
-          </w:rPr>
-          <w:t>3.1 Modelos</w:t>
-        </w:r>
-        <w:r>
-          <w:rPr>
-            <w:webHidden/>
-          </w:rPr>
-          <w:tab/>
-        </w:r>
-        <w:r>
-          <w:rPr>
-            <w:webHidden/>
-          </w:rPr>
-          <w:fldChar w:fldCharType="begin"/>
-        </w:r>
-        <w:r>
-          <w:rPr>
-            <w:webHidden/>
-          </w:rPr>
-          <w:instrText xml:space="preserve"> PAGEREF _Toc235737952 \h </w:instrText>
-        </w:r>
-        <w:r>
-          <w:rPr>
-            <w:webHidden/>
-          </w:rPr>
-        </w:r>
-        <w:r>
-          <w:rPr>
-            <w:webHidden/>
-          </w:rPr>
-          <w:fldChar w:fldCharType="separate"/>
-        </w:r>
-        <w:r>
-          <w:rPr>
-            <w:webHidden/>
-          </w:rPr>
-          <w:t>4</w:t>
-        </w:r>
-        <w:r>
-          <w:rPr>
-            <w:webHidden/>
-          </w:rPr>
-          <w:fldChar w:fldCharType="end"/>
-        </w:r>
-      </w:hyperlink>
-    </w:p>
-    <w:p>
-      <w:pPr>
-        <w:pStyle w:val="TDC2"/>
-        <w:tabs>
-          <w:tab w:val="right" w:leader="dot" w:pos="9350"/>
-        </w:tabs>
-        <w:spacing w:line="276" w:lineRule="auto"/>
-      </w:pPr>
-      <w:hyperlink w:anchor="_Toc235737953" w:history="1">
-        <w:r>
-          <w:rPr>
-            <w:rStyle w:val="Hipervnculo"/>
-          </w:rPr>
-          <w:t>3.2 Vistas y URLs</w:t>
-        </w:r>
-        <w:r>
-          <w:rPr>
-            <w:webHidden/>
-          </w:rPr>
-          <w:tab/>
-        </w:r>
-        <w:r>
-          <w:rPr>
-            <w:webHidden/>
-          </w:rPr>
-          <w:fldChar w:fldCharType="begin"/>
-        </w:r>
-        <w:r>
-          <w:rPr>
-            <w:webHidden/>
-          </w:rPr>
-          <w:instrText xml:space="preserve"> PAGEREF _Toc235737953 \h </w:instrText>
-        </w:r>
-        <w:r>
-          <w:rPr>
-            <w:webHidden/>
-          </w:rPr>
-        </w:r>
-        <w:r>
-          <w:rPr>
-            <w:webHidden/>
-          </w:rPr>
-          <w:fldChar w:fldCharType="separate"/>
-        </w:r>
-        <w:r>
-          <w:rPr>
-            <w:webHidden/>
-          </w:rPr>
-          <w:t>4</w:t>
-        </w:r>
-        <w:r>
-          <w:rPr>
-            <w:webHidden/>
-          </w:rPr>
-          <w:fldChar w:fldCharType="end"/>
-        </w:r>
-      </w:hyperlink>
-    </w:p>
-    <w:p>
-      <w:pPr>
-        <w:pStyle w:val="TDC2"/>
-        <w:tabs>
-          <w:tab w:val="right" w:leader="dot" w:pos="9350"/>
-        </w:tabs>
-        <w:spacing w:line="276" w:lineRule="auto"/>
-      </w:pPr>
-      <w:hyperlink w:anchor="_Toc235737954" w:history="1">
-        <w:r>
-          <w:rPr>
-            <w:rStyle w:val="Hipervnculo"/>
-          </w:rPr>
-          <w:t>3.3 Plantillas y configuracion</w:t>
-        </w:r>
-        <w:r>
-          <w:rPr>
-            <w:webHidden/>
-          </w:rPr>
-          <w:tab/>
-        </w:r>
-        <w:r>
-          <w:rPr>
-            <w:webHidden/>
-          </w:rPr>
-          <w:fldChar w:fldCharType="begin"/>
-        </w:r>
-        <w:r>
-          <w:rPr>
-            <w:webHidden/>
-          </w:rPr>
-          <w:instrText xml:space="preserve"> PAGEREF _Toc235737954 \h </w:instrText>
-        </w:r>
-        <w:r>
-          <w:rPr>
-            <w:webHidden/>
-          </w:rPr>
-        </w:r>
-        <w:r>
-          <w:rPr>
-            <w:webHidden/>
-          </w:rPr>
-          <w:fldChar w:fldCharType="separate"/>
-        </w:r>
-        <w:r>
-          <w:rPr>
-            <w:webHidden/>
-          </w:rPr>
-          <w:t>4</w:t>
-        </w:r>
-        <w:r>
-          <w:rPr>
-            <w:webHidden/>
-          </w:rPr>
-          <w:fldChar w:fldCharType="end"/>
-        </w:r>
-      </w:hyperlink>
-    </w:p>
-    <w:p>
-      <w:pPr>
-        <w:pStyle w:val="TDC1"/>
-        <w:tabs>
-          <w:tab w:val="right" w:leader="dot" w:pos="9350"/>
-        </w:tabs>
-        <w:spacing w:line="276" w:lineRule="auto"/>
-      </w:pPr>
-      <w:hyperlink w:anchor="_Toc235737955" w:history="1">
-        <w:r>
-          <w:rPr>
-            <w:rStyle w:val="Hipervnculo"/>
-          </w:rPr>
-          <w:t>4. Buenas practicas en el diseno</w:t>
-        </w:r>
-        <w:r>
-          <w:rPr>
-            <w:webHidden/>
-          </w:rPr>
-          <w:tab/>
-        </w:r>
-        <w:r>
-          <w:rPr>
-            <w:webHidden/>
-          </w:rPr>
-          <w:fldChar w:fldCharType="begin"/>
-        </w:r>
-        <w:r>
-          <w:rPr>
-            <w:webHidden/>
-          </w:rPr>
-          <w:instrText xml:space="preserve"> PAGEREF _Toc235737955 \h </w:instrText>
-        </w:r>
-        <w:r>
-          <w:rPr>
-            <w:webHidden/>
-          </w:rPr>
-        </w:r>
-        <w:r>
-          <w:rPr>
-            <w:webHidden/>
-          </w:rPr>
-          <w:fldChar w:fldCharType="separate"/>
-        </w:r>
-        <w:r>
-          <w:rPr>
-            <w:webHidden/>
-          </w:rPr>
-          <w:t>4</w:t>
-        </w:r>
-        <w:r>
-          <w:rPr>
-            <w:webHidden/>
-          </w:rPr>
-          <w:fldChar w:fldCharType="end"/>
-        </w:r>
-      </w:hyperlink>
-    </w:p>
-    <w:p>
-      <w:pPr>
-        <w:pStyle w:val="TDC1"/>
-        <w:tabs>
-          <w:tab w:val="right" w:leader="dot" w:pos="9350"/>
-        </w:tabs>
-        <w:spacing w:line="276" w:lineRule="auto"/>
-      </w:pPr>
-      <w:hyperlink w:anchor="_Toc235737956" w:history="1">
-        <w:r>
-          <w:rPr>
-            <w:rStyle w:val="Hipervnculo"/>
-          </w:rPr>
-          <w:t>5. CRUD minimo viable y despliegue local</w:t>
-        </w:r>
-        <w:r>
-          <w:rPr>
-            <w:webHidden/>
-          </w:rPr>
-          <w:tab/>
-        </w:r>
-        <w:r>
-          <w:rPr>
-            <w:webHidden/>
-          </w:rPr>
-          <w:fldChar w:fldCharType="begin"/>
-        </w:r>
-        <w:r>
-          <w:rPr>
-            <w:webHidden/>
-          </w:rPr>
-          <w:instrText xml:space="preserve"> PAGEREF _Toc235737956 \h </w:instrText>
-        </w:r>
-        <w:r>
-          <w:rPr>
-            <w:webHidden/>
-          </w:rPr>
-        </w:r>
-        <w:r>
-          <w:rPr>
-            <w:webHidden/>
-          </w:rPr>
-          <w:fldChar w:fldCharType="separate"/>
-        </w:r>
-        <w:r>
-          <w:rPr>
-            <w:webHidden/>
-          </w:rPr>
-          <w:t>5</w:t>
-        </w:r>
-        <w:r>
-          <w:rPr>
-            <w:webHidden/>
-          </w:rPr>
-          <w:fldChar w:fldCharType="end"/>
-        </w:r>
-      </w:hyperlink>
-    </w:p>
-    <w:p>
-      <w:pPr>
-        <w:pStyle w:val="TDC1"/>
-        <w:tabs>
-          <w:tab w:val="right" w:leader="dot" w:pos="9350"/>
-        </w:tabs>
-        <w:spacing w:line="276" w:lineRule="auto"/>
-      </w:pPr>
-      <w:hyperlink w:anchor="_Toc235737957" w:history="1">
-        <w:r>
-          <w:rPr>
-            <w:rStyle w:val="Hipervnculo"/>
-          </w:rPr>
-          <w:t>6. Conclusiones</w:t>
-        </w:r>
-        <w:r>
-          <w:rPr>
-            <w:webHidden/>
-          </w:rPr>
-          <w:tab/>
-        </w:r>
-        <w:r>
-          <w:rPr>
-            <w:webHidden/>
-          </w:rPr>
-          <w:fldChar w:fldCharType="begin"/>
-        </w:r>
-        <w:r>
-          <w:rPr>
-            <w:webHidden/>
-          </w:rPr>
-          <w:instrText xml:space="preserve"> PAGEREF _Toc235737957 \h </w:instrText>
-        </w:r>
-        <w:r>
-          <w:rPr>
-            <w:webHidden/>
-          </w:rPr>
-        </w:r>
-        <w:r>
-          <w:rPr>
-            <w:webHidden/>
-          </w:rPr>
-          <w:fldChar w:fldCharType="separate"/>
-        </w:r>
-        <w:r>
-          <w:rPr>
-            <w:webHidden/>
-          </w:rPr>
-          <w:t>6</w:t>
-        </w:r>
-        <w:r>
-          <w:rPr>
-            <w:webHidden/>
-          </w:rPr>
-          <w:fldChar w:fldCharType="end"/>
-        </w:r>
-      </w:hyperlink>
-    </w:p>
-    <w:p>
-      <w:pPr>
-        <w:pStyle w:val="TDC1"/>
-        <w:tabs>
-          <w:tab w:val="right" w:leader="dot" w:pos="9350"/>
-        </w:tabs>
-        <w:spacing w:line="276" w:lineRule="auto"/>
-      </w:pPr>
-      <w:hyperlink w:anchor="_Toc235737958" w:history="1">
-        <w:r>
-          <w:rPr>
-            <w:rStyle w:val="Hipervnculo"/>
-          </w:rPr>
-          <w:t>7. Referencias</w:t>
-        </w:r>
-        <w:r>
-          <w:rPr>
-            <w:webHidden/>
-          </w:rPr>
-          <w:tab/>
-        </w:r>
-        <w:r>
-          <w:rPr>
-            <w:webHidden/>
-          </w:rPr>
-          <w:fldChar w:fldCharType="begin"/>
-        </w:r>
-        <w:r>
-          <w:rPr>
-            <w:webHidden/>
-          </w:rPr>
-          <w:instrText xml:space="preserve"> PAGEREF _Toc235737958 \h </w:instrText>
-        </w:r>
-        <w:r>
-          <w:rPr>
-            <w:webHidden/>
-          </w:rPr>
-        </w:r>
-        <w:r>
-          <w:rPr>
-            <w:webHidden/>
-          </w:rPr>
-          <w:fldChar w:fldCharType="separate"/>
-        </w:r>
-        <w:r>
-          <w:rPr>
-            <w:webHidden/>
-          </w:rPr>
-          <w:t>6</w:t>
-        </w:r>
-        <w:r>
-          <w:rPr>
-            <w:webHidden/>
-          </w:rPr>
-          <w:fldChar w:fldCharType="end"/>
-        </w:r>
-      </w:hyperlink>
-    </w:p>
-    <w:p>
-      <w:pPr>
-        <w:spacing w:line="276" w:lineRule="auto"/>
+        <w:contextualSpacing/>
       </w:pPr>
       <w:r>
         <w:fldChar w:fldCharType="end"/>
       </w:r>
     </w:p>
     <w:p>
-      <w:pPr>
-        <w:spacing w:line="276" w:lineRule="auto"/>
-      </w:pPr>
       <w:r>
         <w:br w:type="page"/>
       </w:r>
@@ -1515,7 +1573,6 @@
           <w:ilvl w:val="0"/>
           <w:numId w:val="10"/>
         </w:numPr>
-        <w:spacing w:line="276" w:lineRule="auto"/>
         <w:jc w:val="both"/>
         <w:rPr>
           <w:color w:val="9E1B32"/>
@@ -1523,6 +1580,7 @@
           <w:szCs w:val="22"/>
         </w:rPr>
       </w:pPr>
+      <w:bookmarkStart w:id="0" w:name="_Toc236040762"/>
       <w:r>
         <w:rPr>
           <w:color w:val="9E1B32"/>
@@ -1532,14 +1590,18 @@
         <w:lastRenderedPageBreak/>
         <w:t>Introducción</w:t>
       </w:r>
-    </w:p>
-    <w:p/>
-    <w:p>
-      <w:pPr>
-        <w:spacing w:line="276" w:lineRule="auto"/>
+      <w:bookmarkEnd w:id="0"/>
+    </w:p>
+    <w:p>
+      <w:pPr>
+        <w:contextualSpacing/>
+      </w:pPr>
+    </w:p>
+    <w:p>
+      <w:pPr>
+        <w:contextualSpacing/>
         <w:jc w:val="both"/>
       </w:pPr>
-      <w:bookmarkStart w:id="0" w:name="_Toc235737950"/>
       <w:r>
         <w:t xml:space="preserve">En la Sumativa 1 nuestro equipo propuso </w:t>
       </w:r>
@@ -1596,7 +1658,7 @@
     </w:p>
     <w:p>
       <w:pPr>
-        <w:spacing w:line="276" w:lineRule="auto"/>
+        <w:contextualSpacing/>
         <w:jc w:val="both"/>
       </w:pPr>
       <w:r>
@@ -1605,7 +1667,7 @@
     </w:p>
     <w:p>
       <w:pPr>
-        <w:spacing w:line="276" w:lineRule="auto"/>
+        <w:contextualSpacing/>
         <w:jc w:val="both"/>
       </w:pPr>
       <w:r>
@@ -1644,7 +1706,7 @@
     </w:p>
     <w:p>
       <w:pPr>
-        <w:spacing w:line="276" w:lineRule="auto"/>
+        <w:contextualSpacing/>
         <w:jc w:val="both"/>
       </w:pPr>
       <w:r>
@@ -1653,7 +1715,7 @@
     </w:p>
     <w:p>
       <w:pPr>
-        <w:spacing w:line="276" w:lineRule="auto"/>
+        <w:contextualSpacing/>
         <w:jc w:val="both"/>
       </w:pPr>
       <w:r>
@@ -1706,7 +1768,7 @@
     </w:p>
     <w:p>
       <w:pPr>
-        <w:spacing w:line="276" w:lineRule="auto"/>
+        <w:contextualSpacing/>
         <w:jc w:val="both"/>
       </w:pPr>
       <w:r>
@@ -1715,7 +1777,7 @@
     </w:p>
     <w:p>
       <w:pPr>
-        <w:spacing w:line="276" w:lineRule="auto"/>
+        <w:contextualSpacing/>
         <w:jc w:val="both"/>
       </w:pPr>
       <w:r>
@@ -1765,7 +1827,6 @@
           <w:ilvl w:val="0"/>
           <w:numId w:val="10"/>
         </w:numPr>
-        <w:spacing w:line="276" w:lineRule="auto"/>
         <w:jc w:val="both"/>
         <w:rPr>
           <w:color w:val="9E1B32"/>
@@ -1773,6 +1834,7 @@
           <w:szCs w:val="22"/>
         </w:rPr>
       </w:pPr>
+      <w:bookmarkStart w:id="1" w:name="_Toc236040763"/>
       <w:r>
         <w:rPr>
           <w:color w:val="9E1B32"/>
@@ -1799,15 +1861,14 @@
         </w:rPr>
         <w:t>)</w:t>
       </w:r>
-      <w:bookmarkEnd w:id="0"/>
+      <w:bookmarkEnd w:id="1"/>
     </w:p>
     <w:p/>
     <w:p>
       <w:pPr>
-        <w:spacing w:line="276" w:lineRule="auto"/>
+        <w:contextualSpacing/>
         <w:jc w:val="both"/>
       </w:pPr>
-      <w:bookmarkStart w:id="1" w:name="_Toc235737951"/>
       <w:proofErr w:type="spellStart"/>
       <w:r>
         <w:t>StockControl</w:t>
@@ -1878,7 +1939,6 @@
           <w:ilvl w:val="0"/>
           <w:numId w:val="10"/>
         </w:numPr>
-        <w:spacing w:line="276" w:lineRule="auto"/>
         <w:jc w:val="both"/>
         <w:rPr>
           <w:color w:val="9E1B32"/>
@@ -1886,16 +1946,15 @@
           <w:szCs w:val="22"/>
         </w:rPr>
       </w:pPr>
-      <w:proofErr w:type="spellStart"/>
+      <w:bookmarkStart w:id="2" w:name="_Toc236040764"/>
       <w:r>
         <w:rPr>
           <w:color w:val="9E1B32"/>
           <w:sz w:val="22"/>
           <w:szCs w:val="22"/>
         </w:rPr>
-        <w:t>Adaptacion</w:t>
-      </w:r>
-      <w:proofErr w:type="spellEnd"/>
+        <w:t>Adaptación</w:t>
+      </w:r>
       <w:r>
         <w:rPr>
           <w:color w:val="9E1B32"/>
@@ -1913,13 +1972,13 @@
         </w:rPr>
         <w:t>StockControl</w:t>
       </w:r>
-      <w:bookmarkEnd w:id="1"/>
+      <w:bookmarkEnd w:id="2"/>
       <w:proofErr w:type="spellEnd"/>
     </w:p>
     <w:p/>
     <w:p>
       <w:pPr>
-        <w:spacing w:line="276" w:lineRule="auto"/>
+        <w:contextualSpacing/>
         <w:jc w:val="both"/>
       </w:pPr>
       <w:r>
@@ -1986,13 +2045,13 @@
     </w:p>
     <w:p>
       <w:pPr>
-        <w:spacing w:line="276" w:lineRule="auto"/>
+        <w:contextualSpacing/>
         <w:jc w:val="both"/>
       </w:pPr>
     </w:p>
     <w:p>
       <w:pPr>
-        <w:spacing w:line="276" w:lineRule="auto"/>
+        <w:contextualSpacing/>
         <w:jc w:val="both"/>
       </w:pPr>
       <w:r>
@@ -2062,7 +2121,6 @@
     </w:p>
     <w:p>
       <w:pPr>
-        <w:spacing w:line="276" w:lineRule="auto"/>
         <w:jc w:val="both"/>
       </w:pPr>
     </w:p>
@@ -2089,7 +2147,7 @@
           </w:tcPr>
           <w:p>
             <w:pPr>
-              <w:spacing w:after="40" w:line="276" w:lineRule="auto"/>
+              <w:spacing w:after="40"/>
               <w:jc w:val="both"/>
             </w:pPr>
             <w:r>
@@ -2108,7 +2166,7 @@
           </w:tcPr>
           <w:p>
             <w:pPr>
-              <w:spacing w:after="40" w:line="276" w:lineRule="auto"/>
+              <w:spacing w:after="40"/>
               <w:jc w:val="both"/>
             </w:pPr>
             <w:r>
@@ -2136,7 +2194,7 @@
           </w:tcPr>
           <w:p>
             <w:pPr>
-              <w:spacing w:after="40" w:line="276" w:lineRule="auto"/>
+              <w:spacing w:after="40"/>
               <w:jc w:val="both"/>
             </w:pPr>
             <w:proofErr w:type="spellStart"/>
@@ -2168,7 +2226,7 @@
           </w:tcPr>
           <w:p>
             <w:pPr>
-              <w:spacing w:after="40" w:line="276" w:lineRule="auto"/>
+              <w:contextualSpacing/>
               <w:jc w:val="both"/>
             </w:pPr>
             <w:r>
@@ -2196,7 +2254,7 @@
           </w:tcPr>
           <w:p>
             <w:pPr>
-              <w:spacing w:after="40" w:line="276" w:lineRule="auto"/>
+              <w:contextualSpacing/>
               <w:jc w:val="both"/>
             </w:pPr>
             <w:r>
@@ -2225,7 +2283,7 @@
           </w:tcPr>
           <w:p>
             <w:pPr>
-              <w:spacing w:after="40" w:line="276" w:lineRule="auto"/>
+              <w:contextualSpacing/>
               <w:jc w:val="both"/>
             </w:pPr>
             <w:r>
@@ -2251,7 +2309,7 @@
           </w:tcPr>
           <w:p>
             <w:pPr>
-              <w:spacing w:after="40" w:line="276" w:lineRule="auto"/>
+              <w:contextualSpacing/>
               <w:jc w:val="both"/>
             </w:pPr>
             <w:r>
@@ -2271,7 +2329,7 @@
           </w:tcPr>
           <w:p>
             <w:pPr>
-              <w:spacing w:after="40" w:line="276" w:lineRule="auto"/>
+              <w:contextualSpacing/>
               <w:jc w:val="both"/>
             </w:pPr>
             <w:r>
@@ -2303,7 +2361,7 @@
           </w:tcPr>
           <w:p>
             <w:pPr>
-              <w:spacing w:after="40" w:line="276" w:lineRule="auto"/>
+              <w:contextualSpacing/>
               <w:jc w:val="both"/>
             </w:pPr>
             <w:r>
@@ -2328,7 +2386,7 @@
           </w:tcPr>
           <w:p>
             <w:pPr>
-              <w:spacing w:after="40" w:line="276" w:lineRule="auto"/>
+              <w:contextualSpacing/>
               <w:jc w:val="both"/>
             </w:pPr>
             <w:r>
@@ -2355,7 +2413,7 @@
           </w:tcPr>
           <w:p>
             <w:pPr>
-              <w:spacing w:after="40" w:line="276" w:lineRule="auto"/>
+              <w:contextualSpacing/>
               <w:jc w:val="both"/>
             </w:pPr>
             <w:r>
@@ -2412,7 +2470,7 @@
           </w:tcPr>
           <w:p>
             <w:pPr>
-              <w:spacing w:after="40" w:line="276" w:lineRule="auto"/>
+              <w:contextualSpacing/>
               <w:jc w:val="both"/>
             </w:pPr>
             <w:r>
@@ -2450,7 +2508,7 @@
           </w:tcPr>
           <w:p>
             <w:pPr>
-              <w:spacing w:after="40" w:line="276" w:lineRule="auto"/>
+              <w:contextualSpacing/>
               <w:jc w:val="both"/>
             </w:pPr>
             <w:r>
@@ -2473,7 +2531,7 @@
           </w:tcPr>
           <w:p>
             <w:pPr>
-              <w:spacing w:after="40" w:line="276" w:lineRule="auto"/>
+              <w:contextualSpacing/>
               <w:jc w:val="both"/>
             </w:pPr>
             <w:r>
@@ -2503,7 +2561,7 @@
           </w:tcPr>
           <w:p>
             <w:pPr>
-              <w:spacing w:after="40" w:line="276" w:lineRule="auto"/>
+              <w:contextualSpacing/>
               <w:jc w:val="both"/>
             </w:pPr>
             <w:r>
@@ -2528,7 +2586,7 @@
           </w:tcPr>
           <w:p>
             <w:pPr>
-              <w:spacing w:after="40" w:line="276" w:lineRule="auto"/>
+              <w:contextualSpacing/>
               <w:jc w:val="both"/>
             </w:pPr>
             <w:r>
@@ -2550,7 +2608,7 @@
           </w:tcPr>
           <w:p>
             <w:pPr>
-              <w:spacing w:after="40" w:line="276" w:lineRule="auto"/>
+              <w:contextualSpacing/>
               <w:jc w:val="both"/>
             </w:pPr>
             <w:r>
@@ -2564,7 +2622,7 @@
           </w:tcPr>
           <w:p>
             <w:pPr>
-              <w:spacing w:after="40" w:line="276" w:lineRule="auto"/>
+              <w:contextualSpacing/>
               <w:jc w:val="both"/>
             </w:pPr>
             <w:r>
@@ -2590,7 +2648,7 @@
           </w:tcPr>
           <w:p>
             <w:pPr>
-              <w:spacing w:after="40" w:line="276" w:lineRule="auto"/>
+              <w:contextualSpacing/>
               <w:jc w:val="both"/>
             </w:pPr>
             <w:r>
@@ -2608,7 +2666,7 @@
           </w:tcPr>
           <w:p>
             <w:pPr>
-              <w:spacing w:after="40" w:line="276" w:lineRule="auto"/>
+              <w:contextualSpacing/>
               <w:jc w:val="both"/>
             </w:pPr>
             <w:r>
@@ -2623,7 +2681,7 @@
           </w:tcPr>
           <w:p>
             <w:pPr>
-              <w:spacing w:after="40" w:line="276" w:lineRule="auto"/>
+              <w:contextualSpacing/>
               <w:jc w:val="both"/>
             </w:pPr>
             <w:r>
@@ -2636,14 +2694,13 @@
     <w:p>
       <w:pPr>
         <w:pStyle w:val="Ttulo2"/>
-        <w:spacing w:line="276" w:lineRule="auto"/>
         <w:jc w:val="both"/>
         <w:rPr>
           <w:sz w:val="22"/>
           <w:szCs w:val="22"/>
         </w:rPr>
       </w:pPr>
-      <w:bookmarkStart w:id="2" w:name="_Toc235737952"/>
+      <w:bookmarkStart w:id="3" w:name="_Toc236040765"/>
       <w:r>
         <w:rPr>
           <w:color w:val="9E1B32"/>
@@ -2652,11 +2709,11 @@
         </w:rPr>
         <w:t>3.1 Modelos</w:t>
       </w:r>
-      <w:bookmarkEnd w:id="2"/>
-    </w:p>
-    <w:p>
-      <w:pPr>
-        <w:spacing w:line="276" w:lineRule="auto"/>
+      <w:bookmarkEnd w:id="3"/>
+    </w:p>
+    <w:p>
+      <w:pPr>
+        <w:contextualSpacing/>
         <w:jc w:val="both"/>
       </w:pPr>
       <w:r>
@@ -2678,7 +2735,13 @@
         <w:t>ahí</w:t>
       </w:r>
       <w:r>
-        <w:t xml:space="preserve"> se define que datos guarda el sistema. Creamos dos modelos: </w:t>
+        <w:t xml:space="preserve"> se define que datos guarda el sistema.</w:t>
+      </w:r>
+      <w:r>
+        <w:t xml:space="preserve"> </w:t>
+      </w:r>
+      <w:r>
+        <w:t xml:space="preserve">Creamos dos modelos: </w:t>
       </w:r>
       <w:r>
         <w:t>‘</w:t>
@@ -2874,14 +2937,13 @@
     <w:p>
       <w:pPr>
         <w:pStyle w:val="Ttulo2"/>
-        <w:spacing w:line="276" w:lineRule="auto"/>
         <w:jc w:val="both"/>
         <w:rPr>
           <w:sz w:val="22"/>
           <w:szCs w:val="22"/>
         </w:rPr>
       </w:pPr>
-      <w:bookmarkStart w:id="3" w:name="_Toc235737953"/>
+      <w:bookmarkStart w:id="4" w:name="_Toc236040766"/>
       <w:r>
         <w:rPr>
           <w:color w:val="9E1B32"/>
@@ -2899,18 +2961,17 @@
         </w:rPr>
         <w:t>URLs</w:t>
       </w:r>
-      <w:bookmarkEnd w:id="3"/>
+      <w:bookmarkEnd w:id="4"/>
       <w:proofErr w:type="spellEnd"/>
     </w:p>
     <w:p>
       <w:pPr>
-        <w:spacing w:line="276" w:lineRule="auto"/>
+        <w:contextualSpacing/>
         <w:jc w:val="both"/>
       </w:pPr>
       <w:r>
         <w:t xml:space="preserve">Mantuvimos </w:t>
       </w:r>
-      <w:bookmarkStart w:id="4" w:name="_Toc235737954"/>
       <w:r>
         <w:t xml:space="preserve">las vistas basadas en funciones del ejemplo. Cada vista cumple una parte del CRUD: listar, ver detalle, crear, editar y eliminar. Todas usan el decorador @login_required, </w:t>
       </w:r>
@@ -2983,26 +3044,22 @@
     </w:p>
     <w:p>
       <w:pPr>
-        <w:spacing w:line="276" w:lineRule="auto"/>
         <w:jc w:val="both"/>
       </w:pPr>
     </w:p>
     <w:p>
       <w:pPr>
-        <w:spacing w:line="276" w:lineRule="auto"/>
         <w:jc w:val="both"/>
       </w:pPr>
     </w:p>
     <w:p>
       <w:pPr>
-        <w:spacing w:line="276" w:lineRule="auto"/>
         <w:jc w:val="both"/>
       </w:pPr>
     </w:p>
     <w:p>
       <w:pPr>
         <w:pStyle w:val="Ttulo2"/>
-        <w:spacing w:line="276" w:lineRule="auto"/>
         <w:jc w:val="both"/>
         <w:rPr>
           <w:color w:val="9E1B32"/>
@@ -3010,6 +3067,7 @@
           <w:szCs w:val="22"/>
         </w:rPr>
       </w:pPr>
+      <w:bookmarkStart w:id="5" w:name="_Toc236040767"/>
       <w:r>
         <w:rPr>
           <w:color w:val="9E1B32"/>
@@ -3019,34 +3077,58 @@
         <w:lastRenderedPageBreak/>
         <w:t xml:space="preserve">3.3 Plantillas y </w:t>
       </w:r>
-      <w:proofErr w:type="spellStart"/>
       <w:r>
         <w:rPr>
           <w:color w:val="9E1B32"/>
           <w:sz w:val="22"/>
           <w:szCs w:val="22"/>
         </w:rPr>
-        <w:t>configuracion</w:t>
-      </w:r>
-      <w:bookmarkEnd w:id="4"/>
+        <w:t>configuración</w:t>
+      </w:r>
+      <w:bookmarkEnd w:id="5"/>
+    </w:p>
+    <w:p>
+      <w:pPr>
+        <w:contextualSpacing/>
+        <w:jc w:val="both"/>
+      </w:pPr>
+      <w:r>
+        <w:t xml:space="preserve">En </w:t>
+      </w:r>
+      <w:r>
+        <w:t>las plantillas mostramos los datos de inventario (</w:t>
+      </w:r>
+      <w:r>
+        <w:t>‘</w:t>
+      </w:r>
+      <w:r>
+        <w:t>Nombre</w:t>
+      </w:r>
+      <w:r>
+        <w:t>’</w:t>
+      </w:r>
+      <w:r>
+        <w:t xml:space="preserve">, </w:t>
+      </w:r>
+      <w:r>
+        <w:t>‘</w:t>
+      </w:r>
+      <w:proofErr w:type="spellStart"/>
+      <w:r>
+        <w:t>Codigo</w:t>
+      </w:r>
       <w:proofErr w:type="spellEnd"/>
-    </w:p>
-    <w:p>
-      <w:pPr>
-        <w:spacing w:line="276" w:lineRule="auto"/>
-        <w:jc w:val="both"/>
-      </w:pPr>
-      <w:r>
-        <w:t xml:space="preserve">En </w:t>
-      </w:r>
-      <w:r>
-        <w:t>las plantillas mostramos los datos de inventario (</w:t>
+      <w:r>
+        <w:t>’</w:t>
+      </w:r>
+      <w:r>
+        <w:t xml:space="preserve">, </w:t>
       </w:r>
       <w:r>
         <w:t>‘</w:t>
       </w:r>
       <w:r>
-        <w:t>Nombre</w:t>
+        <w:t>Stock</w:t>
       </w:r>
       <w:r>
         <w:t>’</w:t>
@@ -3059,53 +3141,27 @@
       </w:r>
       <w:proofErr w:type="spellStart"/>
       <w:r>
-        <w:t>Codigo</w:t>
+        <w:t>Ubicacion</w:t>
       </w:r>
       <w:proofErr w:type="spellEnd"/>
       <w:r>
         <w:t>’</w:t>
       </w:r>
       <w:r>
-        <w:t xml:space="preserve">, </w:t>
-      </w:r>
-      <w:r>
-        <w:t>‘</w:t>
-      </w:r>
-      <w:r>
-        <w:t>Stock</w:t>
-      </w:r>
-      <w:r>
-        <w:t>’</w:t>
-      </w:r>
-      <w:r>
-        <w:t xml:space="preserve">, </w:t>
-      </w:r>
-      <w:r>
-        <w:t>‘</w:t>
+        <w:t xml:space="preserve">) en tablas, y usamos un </w:t>
+      </w:r>
+      <w:r>
+        <w:t>diseño</w:t>
+      </w:r>
+      <w:r>
+        <w:t xml:space="preserve"> propio y simple con la marca </w:t>
       </w:r>
       <w:proofErr w:type="spellStart"/>
       <w:r>
-        <w:t>Ubicacion</w:t>
+        <w:t>StockControl</w:t>
       </w:r>
       <w:proofErr w:type="spellEnd"/>
       <w:r>
-        <w:t>’</w:t>
-      </w:r>
-      <w:r>
-        <w:t xml:space="preserve">) en tablas, y usamos un </w:t>
-      </w:r>
-      <w:r>
-        <w:t>diseño</w:t>
-      </w:r>
-      <w:r>
-        <w:t xml:space="preserve"> propio y simple con la marca </w:t>
-      </w:r>
-      <w:proofErr w:type="spellStart"/>
-      <w:r>
-        <w:t>StockControl</w:t>
-      </w:r>
-      <w:proofErr w:type="spellEnd"/>
-      <w:r>
         <w:t xml:space="preserve">. A diferencia del ejemplo, no dependemos de </w:t>
       </w:r>
       <w:r>
@@ -3118,7 +3174,13 @@
         <w:t>aplicación</w:t>
       </w:r>
       <w:r>
-        <w:t xml:space="preserve"> funcione aunque no haya </w:t>
+        <w:t xml:space="preserve"> </w:t>
+      </w:r>
+      <w:r>
+        <w:t>funcione,</w:t>
+      </w:r>
+      <w:r>
+        <w:t xml:space="preserve"> aunque no haya </w:t>
       </w:r>
       <w:r>
         <w:t>conexión</w:t>
@@ -3146,7 +3208,6 @@
           <w:ilvl w:val="0"/>
           <w:numId w:val="10"/>
         </w:numPr>
-        <w:spacing w:line="276" w:lineRule="auto"/>
         <w:jc w:val="both"/>
         <w:rPr>
           <w:color w:val="9E1B32"/>
@@ -3154,7 +3215,7 @@
           <w:szCs w:val="22"/>
         </w:rPr>
       </w:pPr>
-      <w:bookmarkStart w:id="5" w:name="_Toc235737955"/>
+      <w:bookmarkStart w:id="6" w:name="_Toc236040768"/>
       <w:r>
         <w:rPr>
           <w:color w:val="9E1B32"/>
@@ -3163,16 +3224,14 @@
         </w:rPr>
         <w:t xml:space="preserve">Buenas </w:t>
       </w:r>
-      <w:proofErr w:type="spellStart"/>
       <w:r>
         <w:rPr>
           <w:color w:val="9E1B32"/>
           <w:sz w:val="22"/>
           <w:szCs w:val="22"/>
         </w:rPr>
-        <w:t>practicas</w:t>
-      </w:r>
-      <w:proofErr w:type="spellEnd"/>
+        <w:t>prácticas</w:t>
+      </w:r>
       <w:r>
         <w:rPr>
           <w:color w:val="9E1B32"/>
@@ -3189,12 +3248,11 @@
         </w:rPr>
         <w:t>diseño</w:t>
       </w:r>
-      <w:bookmarkEnd w:id="5"/>
+      <w:bookmarkEnd w:id="6"/>
     </w:p>
     <w:p/>
     <w:p>
       <w:pPr>
-        <w:spacing w:line="276" w:lineRule="auto"/>
         <w:jc w:val="both"/>
       </w:pPr>
       <w:r>
@@ -3231,7 +3289,7 @@
         <w:tabs>
           <w:tab w:val="num" w:pos="360"/>
         </w:tabs>
-        <w:spacing w:after="60"/>
+        <w:spacing w:after="0"/>
         <w:ind w:left="360" w:hanging="360"/>
         <w:jc w:val="both"/>
         <w:rPr>
@@ -3295,7 +3353,7 @@
         <w:tabs>
           <w:tab w:val="num" w:pos="360"/>
         </w:tabs>
-        <w:spacing w:after="60"/>
+        <w:spacing w:after="0"/>
         <w:ind w:left="360" w:hanging="360"/>
         <w:jc w:val="both"/>
         <w:rPr>
@@ -3322,23 +3380,7 @@
           <w:rFonts w:cs="Arial"/>
           <w:lang w:val="es-CL"/>
         </w:rPr>
-        <w:t xml:space="preserve"> (DRY): usamos la clase abstracta </w:t>
-      </w:r>
-      <w:proofErr w:type="spellStart"/>
-      <w:r>
-        <w:rPr>
-          <w:rFonts w:cs="Arial"/>
-          <w:lang w:val="es-CL"/>
-        </w:rPr>
-        <w:t>BaseName</w:t>
-      </w:r>
-      <w:proofErr w:type="spellEnd"/>
-      <w:r>
-        <w:rPr>
-          <w:rFonts w:cs="Arial"/>
-          <w:lang w:val="es-CL"/>
-        </w:rPr>
-        <w:t xml:space="preserve"> y una plantilla de formulario reutilizable, para no escribir lo mismo dos veces.</w:t>
+        <w:t>: usamos una plantilla de formulario reutilizable, para no escribir lo mismo dos veces.</w:t>
       </w:r>
     </w:p>
     <w:p>
@@ -3347,7 +3389,7 @@
         <w:tabs>
           <w:tab w:val="num" w:pos="360"/>
         </w:tabs>
-        <w:spacing w:after="60"/>
+        <w:spacing w:after="0"/>
         <w:ind w:left="360" w:hanging="360"/>
         <w:jc w:val="both"/>
         <w:rPr>
@@ -3369,7 +3411,7 @@
         <w:tabs>
           <w:tab w:val="num" w:pos="360"/>
         </w:tabs>
-        <w:spacing w:after="60"/>
+        <w:spacing w:after="0"/>
         <w:ind w:left="360" w:hanging="360"/>
         <w:jc w:val="both"/>
         <w:rPr>
@@ -3447,7 +3489,7 @@
         <w:tabs>
           <w:tab w:val="num" w:pos="360"/>
         </w:tabs>
-        <w:spacing w:after="60"/>
+        <w:spacing w:after="0"/>
         <w:ind w:left="360" w:hanging="360"/>
         <w:jc w:val="both"/>
         <w:rPr>
@@ -3476,7 +3518,7 @@
         <w:tabs>
           <w:tab w:val="num" w:pos="360"/>
         </w:tabs>
-        <w:spacing w:after="60"/>
+        <w:spacing w:after="0"/>
         <w:ind w:left="360" w:hanging="360"/>
         <w:jc w:val="both"/>
         <w:rPr>
@@ -3534,27 +3576,6 @@
         <w:t xml:space="preserve"> adelante.</w:t>
       </w:r>
     </w:p>
-    <w:p/>
-    <w:p/>
-    <w:p/>
-    <w:p/>
-    <w:p/>
-    <w:p/>
-    <w:p/>
-    <w:p/>
-    <w:p/>
-    <w:p/>
-    <w:p/>
-    <w:p/>
-    <w:p/>
-    <w:p/>
-    <w:p/>
-    <w:p/>
-    <w:p/>
-    <w:p/>
-    <w:p/>
-    <w:p/>
-    <w:p/>
     <w:p>
       <w:pPr>
         <w:pStyle w:val="Ttulo1"/>
@@ -3562,7 +3583,6 @@
           <w:ilvl w:val="0"/>
           <w:numId w:val="10"/>
         </w:numPr>
-        <w:spacing w:line="276" w:lineRule="auto"/>
         <w:jc w:val="both"/>
         <w:rPr>
           <w:color w:val="9E1B32"/>
@@ -3570,26 +3590,23 @@
           <w:szCs w:val="22"/>
         </w:rPr>
       </w:pPr>
-      <w:bookmarkStart w:id="6" w:name="_Toc235737956"/>
+      <w:bookmarkStart w:id="7" w:name="_Toc236040769"/>
       <w:r>
         <w:rPr>
           <w:color w:val="9E1B32"/>
           <w:sz w:val="22"/>
           <w:szCs w:val="22"/>
         </w:rPr>
-        <w:lastRenderedPageBreak/>
         <w:t xml:space="preserve">CRUD </w:t>
       </w:r>
-      <w:proofErr w:type="spellStart"/>
       <w:r>
         <w:rPr>
           <w:color w:val="9E1B32"/>
           <w:sz w:val="22"/>
           <w:szCs w:val="22"/>
         </w:rPr>
-        <w:t>minimo</w:t>
-      </w:r>
-      <w:proofErr w:type="spellEnd"/>
+        <w:t>mínimo</w:t>
+      </w:r>
       <w:r>
         <w:rPr>
           <w:color w:val="9E1B32"/>
@@ -3598,12 +3615,12 @@
         </w:rPr>
         <w:t xml:space="preserve"> viable y despliegue local</w:t>
       </w:r>
-      <w:bookmarkEnd w:id="6"/>
+      <w:bookmarkEnd w:id="7"/>
     </w:p>
     <w:p/>
     <w:p>
       <w:pPr>
-        <w:spacing w:line="276" w:lineRule="auto"/>
+        <w:contextualSpacing/>
         <w:jc w:val="both"/>
       </w:pPr>
       <w:r>
@@ -3642,7 +3659,7 @@
     </w:p>
     <w:p>
       <w:pPr>
-        <w:spacing w:before="80" w:after="40" w:line="276" w:lineRule="auto"/>
+        <w:spacing w:before="80" w:after="40"/>
         <w:jc w:val="both"/>
       </w:pPr>
       <w:r>
@@ -3665,7 +3682,7 @@
                     <pic:cNvPicPr/>
                   </pic:nvPicPr>
                   <pic:blipFill>
-                    <a:blip r:embed="rId12"/>
+                    <a:blip r:embed="rId11"/>
                     <a:stretch>
                       <a:fillRect/>
                     </a:stretch>
@@ -3688,7 +3705,7 @@
     </w:p>
     <w:p>
       <w:pPr>
-        <w:spacing w:after="160" w:line="276" w:lineRule="auto"/>
+        <w:contextualSpacing/>
         <w:jc w:val="both"/>
       </w:pPr>
       <w:r>
@@ -3731,7 +3748,7 @@
     </w:p>
     <w:p>
       <w:pPr>
-        <w:spacing w:before="80" w:after="40" w:line="276" w:lineRule="auto"/>
+        <w:spacing w:before="80" w:after="40"/>
         <w:ind w:left="720" w:hanging="720"/>
         <w:jc w:val="both"/>
       </w:pPr>
@@ -3739,6 +3756,7 @@
         <w:rPr>
           <w:noProof/>
         </w:rPr>
+        <w:lastRenderedPageBreak/>
         <w:drawing>
           <wp:inline distT="0" distB="0" distL="0" distR="0" wp14:anchorId="57B54ABB" wp14:editId="69DEA544">
             <wp:extent cx="5943600" cy="1950085"/>
@@ -3755,7 +3773,7 @@
                     <pic:cNvPicPr/>
                   </pic:nvPicPr>
                   <pic:blipFill>
-                    <a:blip r:embed="rId13"/>
+                    <a:blip r:embed="rId12"/>
                     <a:stretch>
                       <a:fillRect/>
                     </a:stretch>
@@ -3778,7 +3796,7 @@
     </w:p>
     <w:p>
       <w:pPr>
-        <w:spacing w:after="160" w:line="276" w:lineRule="auto"/>
+        <w:contextualSpacing/>
         <w:jc w:val="both"/>
         <w:rPr>
           <w:i/>
@@ -3809,22 +3827,28 @@
     </w:p>
     <w:p>
       <w:pPr>
-        <w:spacing w:line="276" w:lineRule="auto"/>
+        <w:contextualSpacing/>
         <w:jc w:val="both"/>
       </w:pPr>
+    </w:p>
+    <w:p>
+      <w:pPr>
+        <w:contextualSpacing/>
+        <w:jc w:val="both"/>
+      </w:pPr>
       <w:r>
         <w:t>Para dejar el proyecto funcionando en un computador (despliegue local), los pasos son:</w:t>
       </w:r>
     </w:p>
     <w:p>
       <w:pPr>
-        <w:spacing w:line="276" w:lineRule="auto"/>
+        <w:contextualSpacing/>
         <w:jc w:val="both"/>
       </w:pPr>
     </w:p>
     <w:p>
       <w:pPr>
-        <w:spacing w:line="276" w:lineRule="auto"/>
+        <w:contextualSpacing/>
         <w:jc w:val="both"/>
       </w:pPr>
       <w:r>
@@ -3854,7 +3878,7 @@
     </w:p>
     <w:p>
       <w:pPr>
-        <w:spacing w:line="276" w:lineRule="auto"/>
+        <w:contextualSpacing/>
         <w:jc w:val="both"/>
       </w:pPr>
       <w:r>
@@ -3879,7 +3903,7 @@
     </w:p>
     <w:p>
       <w:pPr>
-        <w:spacing w:line="276" w:lineRule="auto"/>
+        <w:contextualSpacing/>
         <w:jc w:val="both"/>
       </w:pPr>
       <w:r>
@@ -3904,7 +3928,7 @@
     </w:p>
     <w:p>
       <w:pPr>
-        <w:spacing w:line="276" w:lineRule="auto"/>
+        <w:contextualSpacing/>
         <w:jc w:val="both"/>
       </w:pPr>
       <w:r>
@@ -3926,7 +3950,7 @@
     </w:p>
     <w:p>
       <w:pPr>
-        <w:spacing w:line="276" w:lineRule="auto"/>
+        <w:contextualSpacing/>
         <w:jc w:val="both"/>
       </w:pPr>
       <w:r>
@@ -3948,7 +3972,7 @@
     </w:p>
     <w:p>
       <w:pPr>
-        <w:spacing w:line="276" w:lineRule="auto"/>
+        <w:contextualSpacing/>
         <w:jc w:val="both"/>
       </w:pPr>
       <w:r>
@@ -3970,7 +3994,7 @@
     </w:p>
     <w:p>
       <w:pPr>
-        <w:spacing w:line="276" w:lineRule="auto"/>
+        <w:contextualSpacing/>
         <w:jc w:val="both"/>
       </w:pPr>
       <w:r>
@@ -3985,13 +4009,13 @@
     </w:p>
     <w:p>
       <w:pPr>
-        <w:spacing w:line="276" w:lineRule="auto"/>
+        <w:contextualSpacing/>
         <w:jc w:val="both"/>
       </w:pPr>
     </w:p>
     <w:p>
       <w:pPr>
-        <w:spacing w:line="276" w:lineRule="auto"/>
+        <w:contextualSpacing/>
         <w:jc w:val="both"/>
       </w:pPr>
       <w:r>
@@ -4027,31 +4051,25 @@
       <w:r>
         <w:t xml:space="preserve"> conectados entre </w:t>
       </w:r>
+      <w:r>
+        <w:t>sí</w:t>
+      </w:r>
+      <w:r>
+        <w:t xml:space="preserve"> mediante las </w:t>
+      </w:r>
       <w:proofErr w:type="spellStart"/>
       <w:r>
-        <w:t>si</w:t>
+        <w:t>URLs</w:t>
       </w:r>
       <w:proofErr w:type="spellEnd"/>
       <w:r>
-        <w:t xml:space="preserve"> mediante las </w:t>
-      </w:r>
-      <w:proofErr w:type="spellStart"/>
-      <w:r>
-        <w:t>URLs</w:t>
-      </w:r>
-      <w:proofErr w:type="spellEnd"/>
-      <w:r>
         <w:t xml:space="preserve"> y funcionan </w:t>
       </w:r>
       <w:r>
         <w:t>según</w:t>
       </w:r>
       <w:r>
-        <w:t xml:space="preserve"> lo </w:t>
-      </w:r>
-      <w:r>
-        <w:lastRenderedPageBreak/>
-        <w:t xml:space="preserve">explicado en esta </w:t>
+        <w:t xml:space="preserve"> lo explicado en esta </w:t>
       </w:r>
       <w:r>
         <w:t>documentación</w:t>
@@ -4063,7 +4081,6 @@
     <w:p>
       <w:pPr>
         <w:pStyle w:val="Ttulo1"/>
-        <w:spacing w:line="276" w:lineRule="auto"/>
         <w:jc w:val="both"/>
         <w:rPr>
           <w:color w:val="9E1B32"/>
@@ -4071,7 +4088,7 @@
           <w:szCs w:val="22"/>
         </w:rPr>
       </w:pPr>
-      <w:bookmarkStart w:id="7" w:name="_Toc235737957"/>
+      <w:bookmarkStart w:id="8" w:name="_Toc236040770"/>
       <w:r>
         <w:rPr>
           <w:color w:val="9E1B32"/>
@@ -4080,12 +4097,12 @@
         </w:rPr>
         <w:t>6. Conclusiones</w:t>
       </w:r>
-      <w:bookmarkEnd w:id="7"/>
+      <w:bookmarkEnd w:id="8"/>
     </w:p>
     <w:p/>
     <w:p>
       <w:pPr>
-        <w:spacing w:line="276" w:lineRule="auto"/>
+        <w:contextualSpacing/>
         <w:jc w:val="both"/>
       </w:pPr>
       <w:r>
@@ -4129,13 +4146,13 @@
     </w:p>
     <w:p>
       <w:pPr>
-        <w:spacing w:line="276" w:lineRule="auto"/>
+        <w:contextualSpacing/>
         <w:jc w:val="both"/>
       </w:pPr>
     </w:p>
     <w:p>
       <w:pPr>
-        <w:spacing w:line="276" w:lineRule="auto"/>
+        <w:contextualSpacing/>
         <w:jc w:val="both"/>
       </w:pPr>
       <w:r>
@@ -4245,16 +4262,17 @@
     </w:p>
     <w:p>
       <w:pPr>
-        <w:spacing w:line="276" w:lineRule="auto"/>
+        <w:contextualSpacing/>
         <w:jc w:val="both"/>
       </w:pPr>
     </w:p>
     <w:p>
       <w:pPr>
-        <w:spacing w:line="276" w:lineRule="auto"/>
+        <w:contextualSpacing/>
         <w:jc w:val="both"/>
       </w:pPr>
       <w:r>
+        <w:lastRenderedPageBreak/>
         <w:t xml:space="preserve">Como marco de </w:t>
       </w:r>
       <w:r>
@@ -4317,7 +4335,6 @@
     <w:p>
       <w:pPr>
         <w:pStyle w:val="Ttulo1"/>
-        <w:spacing w:line="276" w:lineRule="auto"/>
         <w:jc w:val="both"/>
         <w:rPr>
           <w:color w:val="9E1B32"/>
@@ -4325,7 +4342,7 @@
           <w:szCs w:val="22"/>
         </w:rPr>
       </w:pPr>
-      <w:bookmarkStart w:id="8" w:name="_Toc235737958"/>
+      <w:bookmarkStart w:id="9" w:name="_Toc236040771"/>
       <w:r>
         <w:rPr>
           <w:color w:val="9E1B32"/>
@@ -4334,13 +4351,17 @@
         </w:rPr>
         <w:t>7. Referencias</w:t>
       </w:r>
-      <w:bookmarkEnd w:id="8"/>
-    </w:p>
-    <w:p/>
-    <w:p>
-      <w:pPr>
-        <w:spacing w:line="276" w:lineRule="auto"/>
+      <w:bookmarkEnd w:id="9"/>
+    </w:p>
+    <w:p>
+      <w:pPr>
+        <w:contextualSpacing/>
+      </w:pPr>
+    </w:p>
+    <w:p>
+      <w:pPr>
         <w:ind w:left="720" w:hanging="720"/>
+        <w:contextualSpacing/>
         <w:jc w:val="both"/>
       </w:pPr>
       <w:r>
@@ -4362,19 +4383,17 @@
       <w:r>
         <w:t xml:space="preserve"> (</w:t>
       </w:r>
-      <w:proofErr w:type="spellStart"/>
-      <w:r>
-        <w:t>version</w:t>
-      </w:r>
-      <w:proofErr w:type="spellEnd"/>
+      <w:r>
+        <w:t>versión</w:t>
+      </w:r>
       <w:r>
         <w:t xml:space="preserve"> 1.11). https://docs.djangoproject.com/en/1.11/</w:t>
       </w:r>
     </w:p>
     <w:p>
       <w:pPr>
-        <w:spacing w:line="276" w:lineRule="auto"/>
         <w:ind w:left="720" w:hanging="720"/>
+        <w:contextualSpacing/>
         <w:jc w:val="both"/>
       </w:pPr>
       <w:r>
@@ -4395,8 +4414,8 @@
     </w:p>
     <w:p>
       <w:pPr>
-        <w:spacing w:line="276" w:lineRule="auto"/>
-        <w:ind w:left="1440" w:hanging="1440"/>
+        <w:ind w:left="709" w:hanging="709"/>
+        <w:contextualSpacing/>
         <w:jc w:val="both"/>
       </w:pPr>
       <w:r>
@@ -4421,7 +4440,7 @@
 </file>
 
 <file path=word/endnotes.xml><?xml version="1.0" encoding="utf-8"?>
-<w:endnotes xmlns:wpc="http://schemas.microsoft.com/office/word/2010/wordprocessingCanvas" xmlns:cx="http://schemas.microsoft.com/office/drawing/2014/chartex" xmlns:cx1="http://schemas.microsoft.com/office/drawing/2015/9/8/chartex" xmlns:cx2="http://schemas.microsoft.com/office/drawing/2015/10/21/chartex" xmlns:cx3="http://schemas.microsoft.com/office/drawing/2016/5/9/chartex" xmlns:cx4="http://schemas.microsoft.com/office/drawing/2016/5/10/chartex" xmlns:cx5="http://schemas.microsoft.com/office/drawing/2016/5/11/chartex" xmlns:cx6="http://schemas.microsoft.com/office/drawing/2016/5/12/chartex" xmlns:cx7="http://schemas.microsoft.com/office/drawing/2016/5/13/chartex" xmlns:cx8="http://schemas.microsoft.com/office/drawing/2016/5/14/chartex" xmlns:mc="http://schemas.openxmlformats.org/markup-compatibility/2006" xmlns:aink="http://schemas.microsoft.com/office/drawing/2016/ink" xmlns:am3d="http://schemas.microsoft.com/office/drawing/2017/model3d" xmlns:o="urn:schemas-microsoft-com:office:office" xmlns:oel="http://schemas.microsoft.com/office/2019/extlst" xmlns:r="http://schemas.openxmlformats.org/officeDocument/2006/relationships" xmlns:m="http://schemas.openxmlformats.org/officeDocument/2006/math" xmlns:v="urn:schemas-microsoft-com:vml" xmlns:wp14="http://schemas.microsoft.com/office/word/2010/wordprocessingDrawing" xmlns:wp="http://schemas.openxmlformats.org/drawingml/2006/wordprocessingDrawing" xmlns:w10="urn:schemas-microsoft-com:office:word" xmlns:w="http://schemas.openxmlformats.org/wordprocessingml/2006/main" xmlns:w14="http://schemas.microsoft.com/office/word/2010/wordml" xmlns:w15="http://schemas.microsoft.com/office/word/2012/wordml" xmlns:w16cei="http://schemas.microsoft.com/office/word/2026/wordml/cei" xmlns:w16cex="http://schemas.microsoft.com/office/word/2018/wordml/cex" xmlns:w16cid="http://schemas.microsoft.com/office/word/2016/wordml/cid" xmlns:w16="http://schemas.microsoft.com/office/word/2018/wordml" xmlns:w16du="http://schemas.microsoft.com/office/word/2023/wordml/word16du" xmlns:w16sdtdh="http://schemas.microsoft.com/office/word/2020/wordml/sdtdatahash" xmlns:w16sdtfl="http://schemas.microsoft.com/office/word/2024/wordml/sdtformatlock" xmlns:w16se="http://schemas.microsoft.com/office/word/2015/wordml/symex" xmlns:wpg="http://schemas.microsoft.com/office/word/2010/wordprocessingGroup" xmlns:wpi="http://schemas.microsoft.com/office/word/2010/wordprocessingInk" xmlns:wne="http://schemas.microsoft.com/office/word/2006/wordml" xmlns:wps="http://schemas.microsoft.com/office/word/2010/wordprocessingShape" mc:Ignorable="w14 w15 w16se w16cid w16 w16cex w16sdtdh w16sdtfl w16du wp14">
+<w:endnotes xmlns:wpc="http://schemas.microsoft.com/office/word/2010/wordprocessingCanvas" xmlns:cx="http://schemas.microsoft.com/office/drawing/2014/chartex" xmlns:cx1="http://schemas.microsoft.com/office/drawing/2015/9/8/chartex" xmlns:cx2="http://schemas.microsoft.com/office/drawing/2015/10/21/chartex" xmlns:cx3="http://schemas.microsoft.com/office/drawing/2016/5/9/chartex" xmlns:cx4="http://schemas.microsoft.com/office/drawing/2016/5/10/chartex" xmlns:cx5="http://schemas.microsoft.com/office/drawing/2016/5/11/chartex" xmlns:cx6="http://schemas.microsoft.com/office/drawing/2016/5/12/chartex" xmlns:cx7="http://schemas.microsoft.com/office/drawing/2016/5/13/chartex" xmlns:cx8="http://schemas.microsoft.com/office/drawing/2016/5/14/chartex" xmlns:mc="http://schemas.openxmlformats.org/markup-compatibility/2006" xmlns:aink="http://schemas.microsoft.com/office/drawing/2016/ink" xmlns:am3d="http://schemas.microsoft.com/office/drawing/2017/model3d" xmlns:o="urn:schemas-microsoft-com:office:office" xmlns:oel="http://schemas.microsoft.com/office/2019/extlst" xmlns:r="http://schemas.openxmlformats.org/officeDocument/2006/relationships" xmlns:m="http://schemas.openxmlformats.org/officeDocument/2006/math" xmlns:v="urn:schemas-microsoft-com:vml" xmlns:wp14="http://schemas.microsoft.com/office/word/2010/wordprocessingDrawing" xmlns:wp="http://schemas.openxmlformats.org/drawingml/2006/wordprocessingDrawing" xmlns:w10="urn:schemas-microsoft-com:office:word" xmlns:w="http://schemas.openxmlformats.org/wordprocessingml/2006/main" xmlns:w14="http://schemas.microsoft.com/office/word/2010/wordml" xmlns:w15="http://schemas.microsoft.com/office/word/2012/wordml" xmlns:w16cex="http://schemas.microsoft.com/office/word/2018/wordml/cex" xmlns:w16cid="http://schemas.microsoft.com/office/word/2016/wordml/cid" xmlns:w16="http://schemas.microsoft.com/office/word/2018/wordml" xmlns:w16du="http://schemas.microsoft.com/office/word/2023/wordml/word16du" xmlns:w16sdtdh="http://schemas.microsoft.com/office/word/2020/wordml/sdtdatahash" xmlns:w16sdtfl="http://schemas.microsoft.com/office/word/2024/wordml/sdtformatlock" xmlns:w16se="http://schemas.microsoft.com/office/word/2015/wordml/symex" xmlns:wpg="http://schemas.microsoft.com/office/word/2010/wordprocessingGroup" xmlns:wpi="http://schemas.microsoft.com/office/word/2010/wordprocessingInk" xmlns:wne="http://schemas.microsoft.com/office/word/2006/wordml" xmlns:wps="http://schemas.microsoft.com/office/word/2010/wordprocessingShape" mc:Ignorable="w14 w15 w16se w16cid w16 w16cex w16sdtdh w16sdtfl w16du wp14">
   <w:endnote w:type="separator" w:id="-1">
     <w:p>
       <w:r>
@@ -4440,7 +4459,7 @@
 </file>
 
 <file path=word/footer1.xml><?xml version="1.0" encoding="utf-8"?>
-<w:ftr xmlns:wpc="http://schemas.microsoft.com/office/word/2010/wordprocessingCanvas" xmlns:cx="http://schemas.microsoft.com/office/drawing/2014/chartex" xmlns:cx1="http://schemas.microsoft.com/office/drawing/2015/9/8/chartex" xmlns:cx2="http://schemas.microsoft.com/office/drawing/2015/10/21/chartex" xmlns:cx3="http://schemas.microsoft.com/office/drawing/2016/5/9/chartex" xmlns:cx4="http://schemas.microsoft.com/office/drawing/2016/5/10/chartex" xmlns:cx5="http://schemas.microsoft.com/office/drawing/2016/5/11/chartex" xmlns:cx6="http://schemas.microsoft.com/office/drawing/2016/5/12/chartex" xmlns:cx7="http://schemas.microsoft.com/office/drawing/2016/5/13/chartex" xmlns:cx8="http://schemas.microsoft.com/office/drawing/2016/5/14/chartex" xmlns:mc="http://schemas.openxmlformats.org/markup-compatibility/2006" xmlns:aink="http://schemas.microsoft.com/office/drawing/2016/ink" xmlns:am3d="http://schemas.microsoft.com/office/drawing/2017/model3d" xmlns:o="urn:schemas-microsoft-com:office:office" xmlns:oel="http://schemas.microsoft.com/office/2019/extlst" xmlns:r="http://schemas.openxmlformats.org/officeDocument/2006/relationships" xmlns:m="http://schemas.openxmlformats.org/officeDocument/2006/math" xmlns:v="urn:schemas-microsoft-com:vml" xmlns:wp14="http://schemas.microsoft.com/office/word/2010/wordprocessingDrawing" xmlns:wp="http://schemas.openxmlformats.org/drawingml/2006/wordprocessingDrawing" xmlns:w10="urn:schemas-microsoft-com:office:word" xmlns:w="http://schemas.openxmlformats.org/wordprocessingml/2006/main" xmlns:w14="http://schemas.microsoft.com/office/word/2010/wordml" xmlns:w15="http://schemas.microsoft.com/office/word/2012/wordml" xmlns:w16cei="http://schemas.microsoft.com/office/word/2026/wordml/cei" xmlns:w16cex="http://schemas.microsoft.com/office/word/2018/wordml/cex" xmlns:w16cid="http://schemas.microsoft.com/office/word/2016/wordml/cid" xmlns:w16="http://schemas.microsoft.com/office/word/2018/wordml" xmlns:w16du="http://schemas.microsoft.com/office/word/2023/wordml/word16du" xmlns:w16sdtdh="http://schemas.microsoft.com/office/word/2020/wordml/sdtdatahash" xmlns:w16sdtfl="http://schemas.microsoft.com/office/word/2024/wordml/sdtformatlock" xmlns:w16se="http://schemas.microsoft.com/office/word/2015/wordml/symex" xmlns:wpg="http://schemas.microsoft.com/office/word/2010/wordprocessingGroup" xmlns:wpi="http://schemas.microsoft.com/office/word/2010/wordprocessingInk" xmlns:wne="http://schemas.microsoft.com/office/word/2006/wordml" xmlns:wps="http://schemas.microsoft.com/office/word/2010/wordprocessingShape" mc:Ignorable="w14 w15 w16se w16cid w16 w16cex w16sdtdh w16sdtfl w16du wp14">
+<w:ftr xmlns:wpc="http://schemas.microsoft.com/office/word/2010/wordprocessingCanvas" xmlns:cx="http://schemas.microsoft.com/office/drawing/2014/chartex" xmlns:cx1="http://schemas.microsoft.com/office/drawing/2015/9/8/chartex" xmlns:cx2="http://schemas.microsoft.com/office/drawing/2015/10/21/chartex" xmlns:cx3="http://schemas.microsoft.com/office/drawing/2016/5/9/chartex" xmlns:cx4="http://schemas.microsoft.com/office/drawing/2016/5/10/chartex" xmlns:cx5="http://schemas.microsoft.com/office/drawing/2016/5/11/chartex" xmlns:cx6="http://schemas.microsoft.com/office/drawing/2016/5/12/chartex" xmlns:cx7="http://schemas.microsoft.com/office/drawing/2016/5/13/chartex" xmlns:cx8="http://schemas.microsoft.com/office/drawing/2016/5/14/chartex" xmlns:mc="http://schemas.openxmlformats.org/markup-compatibility/2006" xmlns:aink="http://schemas.microsoft.com/office/drawing/2016/ink" xmlns:am3d="http://schemas.microsoft.com/office/drawing/2017/model3d" xmlns:o="urn:schemas-microsoft-com:office:office" xmlns:oel="http://schemas.microsoft.com/office/2019/extlst" xmlns:r="http://schemas.openxmlformats.org/officeDocument/2006/relationships" xmlns:m="http://schemas.openxmlformats.org/officeDocument/2006/math" xmlns:v="urn:schemas-microsoft-com:vml" xmlns:wp14="http://schemas.microsoft.com/office/word/2010/wordprocessingDrawing" xmlns:wp="http://schemas.openxmlformats.org/drawingml/2006/wordprocessingDrawing" xmlns:w10="urn:schemas-microsoft-com:office:word" xmlns:w="http://schemas.openxmlformats.org/wordprocessingml/2006/main" xmlns:w14="http://schemas.microsoft.com/office/word/2010/wordml" xmlns:w15="http://schemas.microsoft.com/office/word/2012/wordml" xmlns:w16cex="http://schemas.microsoft.com/office/word/2018/wordml/cex" xmlns:w16cid="http://schemas.microsoft.com/office/word/2016/wordml/cid" xmlns:w16="http://schemas.microsoft.com/office/word/2018/wordml" xmlns:w16du="http://schemas.microsoft.com/office/word/2023/wordml/word16du" xmlns:w16sdtdh="http://schemas.microsoft.com/office/word/2020/wordml/sdtdatahash" xmlns:w16sdtfl="http://schemas.microsoft.com/office/word/2024/wordml/sdtformatlock" xmlns:w16se="http://schemas.microsoft.com/office/word/2015/wordml/symex" xmlns:wpg="http://schemas.microsoft.com/office/word/2010/wordprocessingGroup" xmlns:wpi="http://schemas.microsoft.com/office/word/2010/wordprocessingInk" xmlns:wne="http://schemas.microsoft.com/office/word/2006/wordml" xmlns:wps="http://schemas.microsoft.com/office/word/2010/wordprocessingShape" mc:Ignorable="w14 w15 w16se w16cid w16 w16cex w16sdtdh w16sdtfl w16du wp14">
   <w:p>
     <w:pPr>
       <w:pBdr>
@@ -4454,13 +4473,60 @@
         <w:tab w:val="center" w:pos="4252"/>
         <w:tab w:val="right" w:pos="8504"/>
       </w:tabs>
+      <w:contextualSpacing/>
+      <w:jc w:val="right"/>
       <w:rPr>
         <w:color w:val="000000"/>
+        <w:sz w:val="18"/>
+        <w:szCs w:val="18"/>
       </w:rPr>
     </w:pPr>
     <w:r>
       <w:rPr>
+        <w:color w:val="000000"/>
+        <w:sz w:val="18"/>
+        <w:szCs w:val="18"/>
+      </w:rPr>
+      <w:fldChar w:fldCharType="begin"/>
+    </w:r>
+    <w:r>
+      <w:rPr>
+        <w:color w:val="000000"/>
+        <w:sz w:val="18"/>
+        <w:szCs w:val="18"/>
+      </w:rPr>
+      <w:instrText>PAGE   \* MERGEFORMAT</w:instrText>
+    </w:r>
+    <w:r>
+      <w:rPr>
+        <w:color w:val="000000"/>
+        <w:sz w:val="18"/>
+        <w:szCs w:val="18"/>
+      </w:rPr>
+      <w:fldChar w:fldCharType="separate"/>
+    </w:r>
+    <w:r>
+      <w:rPr>
+        <w:color w:val="000000"/>
+        <w:sz w:val="18"/>
+        <w:szCs w:val="18"/>
+        <w:lang w:val="es-ES"/>
+      </w:rPr>
+      <w:t>1</w:t>
+    </w:r>
+    <w:r>
+      <w:rPr>
+        <w:color w:val="000000"/>
+        <w:sz w:val="18"/>
+        <w:szCs w:val="18"/>
+      </w:rPr>
+      <w:fldChar w:fldCharType="end"/>
+    </w:r>
+    <w:r>
+      <w:rPr>
         <w:noProof/>
+        <w:sz w:val="18"/>
+        <w:szCs w:val="18"/>
       </w:rPr>
       <w:drawing>
         <wp:anchor distT="0" distB="0" distL="0" distR="0" simplePos="0" relativeHeight="251659264" behindDoc="1" locked="0" layoutInCell="1" hidden="0" allowOverlap="1" wp14:anchorId="79A457E3" wp14:editId="30CC8DE9">
@@ -4511,7 +4577,7 @@
 </file>
 
 <file path=word/footnotes.xml><?xml version="1.0" encoding="utf-8"?>
-<w:footnotes xmlns:wpc="http://schemas.microsoft.com/office/word/2010/wordprocessingCanvas" xmlns:cx="http://schemas.microsoft.com/office/drawing/2014/chartex" xmlns:cx1="http://schemas.microsoft.com/office/drawing/2015/9/8/chartex" xmlns:cx2="http://schemas.microsoft.com/office/drawing/2015/10/21/chartex" xmlns:cx3="http://schemas.microsoft.com/office/drawing/2016/5/9/chartex" xmlns:cx4="http://schemas.microsoft.com/office/drawing/2016/5/10/chartex" xmlns:cx5="http://schemas.microsoft.com/office/drawing/2016/5/11/chartex" xmlns:cx6="http://schemas.microsoft.com/office/drawing/2016/5/12/chartex" xmlns:cx7="http://schemas.microsoft.com/office/drawing/2016/5/13/chartex" xmlns:cx8="http://schemas.microsoft.com/office/drawing/2016/5/14/chartex" xmlns:mc="http://schemas.openxmlformats.org/markup-compatibility/2006" xmlns:aink="http://schemas.microsoft.com/office/drawing/2016/ink" xmlns:am3d="http://schemas.microsoft.com/office/drawing/2017/model3d" xmlns:o="urn:schemas-microsoft-com:office:office" xmlns:oel="http://schemas.microsoft.com/office/2019/extlst" xmlns:r="http://schemas.openxmlformats.org/officeDocument/2006/relationships" xmlns:m="http://schemas.openxmlformats.org/officeDocument/2006/math" xmlns:v="urn:schemas-microsoft-com:vml" xmlns:wp14="http://schemas.microsoft.com/office/word/2010/wordprocessingDrawing" xmlns:wp="http://schemas.openxmlformats.org/drawingml/2006/wordprocessingDrawing" xmlns:w10="urn:schemas-microsoft-com:office:word" xmlns:w="http://schemas.openxmlformats.org/wordprocessingml/2006/main" xmlns:w14="http://schemas.microsoft.com/office/word/2010/wordml" xmlns:w15="http://schemas.microsoft.com/office/word/2012/wordml" xmlns:w16cei="http://schemas.microsoft.com/office/word/2026/wordml/cei" xmlns:w16cex="http://schemas.microsoft.com/office/word/2018/wordml/cex" xmlns:w16cid="http://schemas.microsoft.com/office/word/2016/wordml/cid" xmlns:w16="http://schemas.microsoft.com/office/word/2018/wordml" xmlns:w16du="http://schemas.microsoft.com/office/word/2023/wordml/word16du" xmlns:w16sdtdh="http://schemas.microsoft.com/office/word/2020/wordml/sdtdatahash" xmlns:w16sdtfl="http://schemas.microsoft.com/office/word/2024/wordml/sdtformatlock" xmlns:w16se="http://schemas.microsoft.com/office/word/2015/wordml/symex" xmlns:wpg="http://schemas.microsoft.com/office/word/2010/wordprocessingGroup" xmlns:wpi="http://schemas.microsoft.com/office/word/2010/wordprocessingInk" xmlns:wne="http://schemas.microsoft.com/office/word/2006/wordml" xmlns:wps="http://schemas.microsoft.com/office/word/2010/wordprocessingShape" mc:Ignorable="w14 w15 w16se w16cid w16 w16cex w16sdtdh w16sdtfl w16du wp14">
+<w:footnotes xmlns:wpc="http://schemas.microsoft.com/office/word/2010/wordprocessingCanvas" xmlns:cx="http://schemas.microsoft.com/office/drawing/2014/chartex" xmlns:cx1="http://schemas.microsoft.com/office/drawing/2015/9/8/chartex" xmlns:cx2="http://schemas.microsoft.com/office/drawing/2015/10/21/chartex" xmlns:cx3="http://schemas.microsoft.com/office/drawing/2016/5/9/chartex" xmlns:cx4="http://schemas.microsoft.com/office/drawing/2016/5/10/chartex" xmlns:cx5="http://schemas.microsoft.com/office/drawing/2016/5/11/chartex" xmlns:cx6="http://schemas.microsoft.com/office/drawing/2016/5/12/chartex" xmlns:cx7="http://schemas.microsoft.com/office/drawing/2016/5/13/chartex" xmlns:cx8="http://schemas.microsoft.com/office/drawing/2016/5/14/chartex" xmlns:mc="http://schemas.openxmlformats.org/markup-compatibility/2006" xmlns:aink="http://schemas.microsoft.com/office/drawing/2016/ink" xmlns:am3d="http://schemas.microsoft.com/office/drawing/2017/model3d" xmlns:o="urn:schemas-microsoft-com:office:office" xmlns:oel="http://schemas.microsoft.com/office/2019/extlst" xmlns:r="http://schemas.openxmlformats.org/officeDocument/2006/relationships" xmlns:m="http://schemas.openxmlformats.org/officeDocument/2006/math" xmlns:v="urn:schemas-microsoft-com:vml" xmlns:wp14="http://schemas.microsoft.com/office/word/2010/wordprocessingDrawing" xmlns:wp="http://schemas.openxmlformats.org/drawingml/2006/wordprocessingDrawing" xmlns:w10="urn:schemas-microsoft-com:office:word" xmlns:w="http://schemas.openxmlformats.org/wordprocessingml/2006/main" xmlns:w14="http://schemas.microsoft.com/office/word/2010/wordml" xmlns:w15="http://schemas.microsoft.com/office/word/2012/wordml" xmlns:w16cex="http://schemas.microsoft.com/office/word/2018/wordml/cex" xmlns:w16cid="http://schemas.microsoft.com/office/word/2016/wordml/cid" xmlns:w16="http://schemas.microsoft.com/office/word/2018/wordml" xmlns:w16du="http://schemas.microsoft.com/office/word/2023/wordml/word16du" xmlns:w16sdtdh="http://schemas.microsoft.com/office/word/2020/wordml/sdtdatahash" xmlns:w16sdtfl="http://schemas.microsoft.com/office/word/2024/wordml/sdtformatlock" xmlns:w16se="http://schemas.microsoft.com/office/word/2015/wordml/symex" xmlns:wpg="http://schemas.microsoft.com/office/word/2010/wordprocessingGroup" xmlns:wpi="http://schemas.microsoft.com/office/word/2010/wordprocessingInk" xmlns:wne="http://schemas.microsoft.com/office/word/2006/wordml" xmlns:wps="http://schemas.microsoft.com/office/word/2010/wordprocessingShape" mc:Ignorable="w14 w15 w16se w16cid w16 w16cex w16sdtdh w16sdtfl w16du wp14">
   <w:footnote w:type="separator" w:id="-1">
     <w:p>
       <w:r>
@@ -4530,7 +4596,7 @@
 </file>
 
 <file path=word/header1.xml><?xml version="1.0" encoding="utf-8"?>
-<w:hdr xmlns:wpc="http://schemas.microsoft.com/office/word/2010/wordprocessingCanvas" xmlns:cx="http://schemas.microsoft.com/office/drawing/2014/chartex" xmlns:cx1="http://schemas.microsoft.com/office/drawing/2015/9/8/chartex" xmlns:cx2="http://schemas.microsoft.com/office/drawing/2015/10/21/chartex" xmlns:cx3="http://schemas.microsoft.com/office/drawing/2016/5/9/chartex" xmlns:cx4="http://schemas.microsoft.com/office/drawing/2016/5/10/chartex" xmlns:cx5="http://schemas.microsoft.com/office/drawing/2016/5/11/chartex" xmlns:cx6="http://schemas.microsoft.com/office/drawing/2016/5/12/chartex" xmlns:cx7="http://schemas.microsoft.com/office/drawing/2016/5/13/chartex" xmlns:cx8="http://schemas.microsoft.com/office/drawing/2016/5/14/chartex" xmlns:mc="http://schemas.openxmlformats.org/markup-compatibility/2006" xmlns:aink="http://schemas.microsoft.com/office/drawing/2016/ink" xmlns:am3d="http://schemas.microsoft.com/office/drawing/2017/model3d" xmlns:o="urn:schemas-microsoft-com:office:office" xmlns:oel="http://schemas.microsoft.com/office/2019/extlst" xmlns:r="http://schemas.openxmlformats.org/officeDocument/2006/relationships" xmlns:m="http://schemas.openxmlformats.org/officeDocument/2006/math" xmlns:v="urn:schemas-microsoft-com:vml" xmlns:wp14="http://schemas.microsoft.com/office/word/2010/wordprocessingDrawing" xmlns:wp="http://schemas.openxmlformats.org/drawingml/2006/wordprocessingDrawing" xmlns:w10="urn:schemas-microsoft-com:office:word" xmlns:w="http://schemas.openxmlformats.org/wordprocessingml/2006/main" xmlns:w14="http://schemas.microsoft.com/office/word/2010/wordml" xmlns:w15="http://schemas.microsoft.com/office/word/2012/wordml" xmlns:w16cei="http://schemas.microsoft.com/office/word/2026/wordml/cei" xmlns:w16cex="http://schemas.microsoft.com/office/word/2018/wordml/cex" xmlns:w16cid="http://schemas.microsoft.com/office/word/2016/wordml/cid" xmlns:w16="http://schemas.microsoft.com/office/word/2018/wordml" xmlns:w16du="http://schemas.microsoft.com/office/word/2023/wordml/word16du" xmlns:w16sdtdh="http://schemas.microsoft.com/office/word/2020/wordml/sdtdatahash" xmlns:w16sdtfl="http://schemas.microsoft.com/office/word/2024/wordml/sdtformatlock" xmlns:w16se="http://schemas.microsoft.com/office/word/2015/wordml/symex" xmlns:wpg="http://schemas.microsoft.com/office/word/2010/wordprocessingGroup" xmlns:wpi="http://schemas.microsoft.com/office/word/2010/wordprocessingInk" xmlns:wne="http://schemas.microsoft.com/office/word/2006/wordml" xmlns:wps="http://schemas.microsoft.com/office/word/2010/wordprocessingShape" mc:Ignorable="w14 w15 w16se w16cid w16 w16cex w16sdtdh w16sdtfl w16du wp14">
+<w:hdr xmlns:wpc="http://schemas.microsoft.com/office/word/2010/wordprocessingCanvas" xmlns:cx="http://schemas.microsoft.com/office/drawing/2014/chartex" xmlns:cx1="http://schemas.microsoft.com/office/drawing/2015/9/8/chartex" xmlns:cx2="http://schemas.microsoft.com/office/drawing/2015/10/21/chartex" xmlns:cx3="http://schemas.microsoft.com/office/drawing/2016/5/9/chartex" xmlns:cx4="http://schemas.microsoft.com/office/drawing/2016/5/10/chartex" xmlns:cx5="http://schemas.microsoft.com/office/drawing/2016/5/11/chartex" xmlns:cx6="http://schemas.microsoft.com/office/drawing/2016/5/12/chartex" xmlns:cx7="http://schemas.microsoft.com/office/drawing/2016/5/13/chartex" xmlns:cx8="http://schemas.microsoft.com/office/drawing/2016/5/14/chartex" xmlns:mc="http://schemas.openxmlformats.org/markup-compatibility/2006" xmlns:aink="http://schemas.microsoft.com/office/drawing/2016/ink" xmlns:am3d="http://schemas.microsoft.com/office/drawing/2017/model3d" xmlns:o="urn:schemas-microsoft-com:office:office" xmlns:oel="http://schemas.microsoft.com/office/2019/extlst" xmlns:r="http://schemas.openxmlformats.org/officeDocument/2006/relationships" xmlns:m="http://schemas.openxmlformats.org/officeDocument/2006/math" xmlns:v="urn:schemas-microsoft-com:vml" xmlns:wp14="http://schemas.microsoft.com/office/word/2010/wordprocessingDrawing" xmlns:wp="http://schemas.openxmlformats.org/drawingml/2006/wordprocessingDrawing" xmlns:w10="urn:schemas-microsoft-com:office:word" xmlns:w="http://schemas.openxmlformats.org/wordprocessingml/2006/main" xmlns:w14="http://schemas.microsoft.com/office/word/2010/wordml" xmlns:w15="http://schemas.microsoft.com/office/word/2012/wordml" xmlns:w16cex="http://schemas.microsoft.com/office/word/2018/wordml/cex" xmlns:w16cid="http://schemas.microsoft.com/office/word/2016/wordml/cid" xmlns:w16="http://schemas.microsoft.com/office/word/2018/wordml" xmlns:w16du="http://schemas.microsoft.com/office/word/2023/wordml/word16du" xmlns:w16sdtdh="http://schemas.microsoft.com/office/word/2020/wordml/sdtdatahash" xmlns:w16sdtfl="http://schemas.microsoft.com/office/word/2024/wordml/sdtformatlock" xmlns:w16se="http://schemas.microsoft.com/office/word/2015/wordml/symex" xmlns:wpg="http://schemas.microsoft.com/office/word/2010/wordprocessingGroup" xmlns:wpi="http://schemas.microsoft.com/office/word/2010/wordprocessingInk" xmlns:wne="http://schemas.microsoft.com/office/word/2006/wordml" xmlns:wps="http://schemas.microsoft.com/office/word/2010/wordprocessingShape" mc:Ignorable="w14 w15 w16se w16cid w16 w16cex w16sdtdh w16sdtfl w16du wp14">
   <w:p>
     <w:pPr>
       <w:pBdr>
@@ -4659,7 +4725,7 @@
               <v:stroke joinstyle="miter"/>
               <v:path gradientshapeok="t" o:connecttype="rect"/>
             </v:shapetype>
-            <v:shape id="Cuadro de texto 2" o:spid="_x0000_s1030" type="#_x0000_t202" style="position:absolute;margin-left:-6.7pt;margin-top:-20.9pt;width:445.05pt;height:34.8pt;z-index:251661312;visibility:visible;mso-wrap-style:square;mso-width-percent:0;mso-height-percent:200;mso-wrap-distance-left:9pt;mso-wrap-distance-top:3.6pt;mso-wrap-distance-right:9pt;mso-wrap-distance-bottom:3.6pt;mso-position-horizontal:absolute;mso-position-horizontal-relative:text;mso-position-vertical:absolute;mso-position-vertical-relative:text;mso-width-percent:0;mso-height-percent:200;mso-width-relative:margin;mso-height-relative:margin;v-text-anchor:top" o:gfxdata="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" filled="f" stroked="f">
+            <v:shape id="Cuadro de texto 2" o:spid="_x0000_s1026" type="#_x0000_t202" style="position:absolute;margin-left:-6.7pt;margin-top:-20.9pt;width:445.05pt;height:34.8pt;z-index:251661312;visibility:visible;mso-wrap-style:square;mso-width-percent:0;mso-height-percent:200;mso-wrap-distance-left:9pt;mso-wrap-distance-top:3.6pt;mso-wrap-distance-right:9pt;mso-wrap-distance-bottom:3.6pt;mso-position-horizontal:absolute;mso-position-horizontal-relative:text;mso-position-vertical:absolute;mso-position-vertical-relative:text;mso-width-percent:0;mso-height-percent:200;mso-width-relative:margin;mso-height-relative:margin;v-text-anchor:top" o:gfxdata="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" filled="f" stroked="f">
               <v:textbox style="mso-fit-shape-to-text:t">
                 <w:txbxContent>
                   <w:p>
@@ -4749,7 +4815,7 @@
 </file>
 
 <file path=word/numbering.xml><?xml version="1.0" encoding="utf-8"?>
-<w:numbering xmlns:wpc="http://schemas.microsoft.com/office/word/2010/wordprocessingCanvas" xmlns:cx="http://schemas.microsoft.com/office/drawing/2014/chartex" xmlns:cx1="http://schemas.microsoft.com/office/drawing/2015/9/8/chartex" xmlns:cx2="http://schemas.microsoft.com/office/drawing/2015/10/21/chartex" xmlns:cx3="http://schemas.microsoft.com/office/drawing/2016/5/9/chartex" xmlns:cx4="http://schemas.microsoft.com/office/drawing/2016/5/10/chartex" xmlns:cx5="http://schemas.microsoft.com/office/drawing/2016/5/11/chartex" xmlns:cx6="http://schemas.microsoft.com/office/drawing/2016/5/12/chartex" xmlns:cx7="http://schemas.microsoft.com/office/drawing/2016/5/13/chartex" xmlns:cx8="http://schemas.microsoft.com/office/drawing/2016/5/14/chartex" xmlns:mc="http://schemas.openxmlformats.org/markup-compatibility/2006" xmlns:aink="http://schemas.microsoft.com/office/drawing/2016/ink" xmlns:am3d="http://schemas.microsoft.com/office/drawing/2017/model3d" xmlns:o="urn:schemas-microsoft-com:office:office" xmlns:oel="http://schemas.microsoft.com/office/2019/extlst" xmlns:r="http://schemas.openxmlformats.org/officeDocument/2006/relationships" xmlns:m="http://schemas.openxmlformats.org/officeDocument/2006/math" xmlns:v="urn:schemas-microsoft-com:vml" xmlns:wp14="http://schemas.microsoft.com/office/word/2010/wordprocessingDrawing" xmlns:wp="http://schemas.openxmlformats.org/drawingml/2006/wordprocessingDrawing" xmlns:w10="urn:schemas-microsoft-com:office:word" xmlns:w="http://schemas.openxmlformats.org/wordprocessingml/2006/main" xmlns:w14="http://schemas.microsoft.com/office/word/2010/wordml" xmlns:w15="http://schemas.microsoft.com/office/word/2012/wordml" xmlns:w16cei="http://schemas.microsoft.com/office/word/2026/wordml/cei" xmlns:w16cex="http://schemas.microsoft.com/office/word/2018/wordml/cex" xmlns:w16cid="http://schemas.microsoft.com/office/word/2016/wordml/cid" xmlns:w16="http://schemas.microsoft.com/office/word/2018/wordml" xmlns:w16du="http://schemas.microsoft.com/office/word/2023/wordml/word16du" xmlns:w16sdtdh="http://schemas.microsoft.com/office/word/2020/wordml/sdtdatahash" xmlns:w16sdtfl="http://schemas.microsoft.com/office/word/2024/wordml/sdtformatlock" xmlns:w16se="http://schemas.microsoft.com/office/word/2015/wordml/symex" xmlns:wpg="http://schemas.microsoft.com/office/word/2010/wordprocessingGroup" xmlns:wpi="http://schemas.microsoft.com/office/word/2010/wordprocessingInk" xmlns:wne="http://schemas.microsoft.com/office/word/2006/wordml" xmlns:wps="http://schemas.microsoft.com/office/word/2010/wordprocessingShape" mc:Ignorable="w14 w15 w16se w16cid w16 w16cex w16sdtdh w16sdtfl w16du wp14">
+<w:numbering xmlns:wpc="http://schemas.microsoft.com/office/word/2010/wordprocessingCanvas" xmlns:cx="http://schemas.microsoft.com/office/drawing/2014/chartex" xmlns:cx1="http://schemas.microsoft.com/office/drawing/2015/9/8/chartex" xmlns:cx2="http://schemas.microsoft.com/office/drawing/2015/10/21/chartex" xmlns:cx3="http://schemas.microsoft.com/office/drawing/2016/5/9/chartex" xmlns:cx4="http://schemas.microsoft.com/office/drawing/2016/5/10/chartex" xmlns:cx5="http://schemas.microsoft.com/office/drawing/2016/5/11/chartex" xmlns:cx6="http://schemas.microsoft.com/office/drawing/2016/5/12/chartex" xmlns:cx7="http://schemas.microsoft.com/office/drawing/2016/5/13/chartex" xmlns:cx8="http://schemas.microsoft.com/office/drawing/2016/5/14/chartex" xmlns:mc="http://schemas.openxmlformats.org/markup-compatibility/2006" xmlns:aink="http://schemas.microsoft.com/office/drawing/2016/ink" xmlns:am3d="http://schemas.microsoft.com/office/drawing/2017/model3d" xmlns:o="urn:schemas-microsoft-com:office:office" xmlns:oel="http://schemas.microsoft.com/office/2019/extlst" xmlns:r="http://schemas.openxmlformats.org/officeDocument/2006/relationships" xmlns:m="http://schemas.openxmlformats.org/officeDocument/2006/math" xmlns:v="urn:schemas-microsoft-com:vml" xmlns:wp14="http://schemas.microsoft.com/office/word/2010/wordprocessingDrawing" xmlns:wp="http://schemas.openxmlformats.org/drawingml/2006/wordprocessingDrawing" xmlns:w10="urn:schemas-microsoft-com:office:word" xmlns:w="http://schemas.openxmlformats.org/wordprocessingml/2006/main" xmlns:w14="http://schemas.microsoft.com/office/word/2010/wordml" xmlns:w15="http://schemas.microsoft.com/office/word/2012/wordml" xmlns:w16cex="http://schemas.microsoft.com/office/word/2018/wordml/cex" xmlns:w16cid="http://schemas.microsoft.com/office/word/2016/wordml/cid" xmlns:w16="http://schemas.microsoft.com/office/word/2018/wordml" xmlns:w16du="http://schemas.microsoft.com/office/word/2023/wordml/word16du" xmlns:w16sdtdh="http://schemas.microsoft.com/office/word/2020/wordml/sdtdatahash" xmlns:w16sdtfl="http://schemas.microsoft.com/office/word/2024/wordml/sdtformatlock" xmlns:w16se="http://schemas.microsoft.com/office/word/2015/wordml/symex" xmlns:wpg="http://schemas.microsoft.com/office/word/2010/wordprocessingGroup" xmlns:wpi="http://schemas.microsoft.com/office/word/2010/wordprocessingInk" xmlns:wne="http://schemas.microsoft.com/office/word/2006/wordml" xmlns:wps="http://schemas.microsoft.com/office/word/2010/wordprocessingShape" mc:Ignorable="w14 w15 w16se w16cid w16 w16cex w16sdtdh w16sdtfl w16du wp14">
   <w:abstractNum w:abstractNumId="0" w15:restartNumberingAfterBreak="0">
     <w:nsid w:val="FFFFFF89"/>
     <w:multiLevelType w:val="singleLevel"/>
@@ -5633,7 +5699,7 @@
     </w:rPrDefault>
     <w:pPrDefault>
       <w:pPr>
-        <w:widowControl w:val="0"/>
+        <w:spacing w:line="276" w:lineRule="auto"/>
       </w:pPr>
     </w:pPrDefault>
   </w:docDefaults>
@@ -6019,10 +6085,6 @@
     <w:name w:val="Normal"/>
     <w:qFormat/>
     <w:rsid w:val="00A07B42"/>
-    <w:pPr>
-      <w:autoSpaceDE w:val="0"/>
-      <w:autoSpaceDN w:val="0"/>
-    </w:pPr>
     <w:rPr>
       <w:lang w:val="es-CL" w:eastAsia="es-ES" w:bidi="es-ES"/>
     </w:rPr>
@@ -6369,9 +6431,6 @@
     <w:unhideWhenUsed/>
     <w:rsid w:val="006F48D0"/>
     <w:pPr>
-      <w:widowControl/>
-      <w:autoSpaceDE/>
-      <w:autoSpaceDN/>
       <w:spacing w:before="100" w:beforeAutospacing="1" w:after="100" w:afterAutospacing="1"/>
     </w:pPr>
     <w:rPr>
@@ -6508,9 +6567,6 @@
     <w:basedOn w:val="Normal"/>
     <w:rsid w:val="00055091"/>
     <w:pPr>
-      <w:widowControl/>
-      <w:autoSpaceDE/>
-      <w:autoSpaceDN/>
       <w:spacing w:before="100" w:beforeAutospacing="1" w:after="100" w:afterAutospacing="1"/>
     </w:pPr>
     <w:rPr>
@@ -6611,9 +6667,6 @@
     <w:uiPriority w:val="99"/>
     <w:semiHidden/>
     <w:rsid w:val="0051161C"/>
-    <w:pPr>
-      <w:widowControl/>
-    </w:pPr>
     <w:rPr>
       <w:lang w:eastAsia="es-ES" w:bidi="es-ES"/>
     </w:rPr>
@@ -6625,16 +6678,13 @@
     <w:unhideWhenUsed/>
     <w:rsid w:val="000A10C4"/>
     <w:pPr>
-      <w:widowControl/>
       <w:numPr>
         <w:numId w:val="9"/>
       </w:numPr>
       <w:tabs>
         <w:tab w:val="clear" w:pos="360"/>
       </w:tabs>
-      <w:autoSpaceDE/>
-      <w:autoSpaceDN/>
-      <w:spacing w:after="120" w:line="276" w:lineRule="auto"/>
+      <w:spacing w:after="120"/>
       <w:ind w:left="0" w:firstLine="0"/>
       <w:contextualSpacing/>
     </w:pPr>

</xml_diff>

<commit_message>
ajuste a la rúbrica
</commit_message>
<xml_diff>
--- a/APTC106_s6grupo6.docx
+++ b/APTC106_s6grupo6.docx
@@ -36,6 +36,7 @@
       <w:r>
         <w:rPr>
           <w:rFonts w:eastAsia="Times New Roman"/>
+          <w:noProof/>
           <w:color w:val="000000"/>
         </w:rPr>
         <w:drawing>
@@ -730,7 +731,7 @@
       <w:r>
         <w:fldChar w:fldCharType="separate"/>
       </w:r>
-      <w:hyperlink w:anchor="_Toc236040762" w:history="1">
+      <w:hyperlink w:anchor="_Toc236041707" w:history="1">
         <w:r>
           <w:rPr>
             <w:rStyle w:val="Hipervnculo"/>
@@ -776,7 +777,7 @@
             <w:noProof/>
             <w:webHidden/>
           </w:rPr>
-          <w:instrText xml:space="preserve"> PAGEREF _Toc236040762 \h </w:instrText>
+          <w:instrText xml:space="preserve"> PAGEREF _Toc236041707 \h </w:instrText>
         </w:r>
         <w:r>
           <w:rPr>
@@ -824,7 +825,7 @@
           <w14:ligatures w14:val="standardContextual"/>
         </w:rPr>
       </w:pPr>
-      <w:hyperlink w:anchor="_Toc236040763" w:history="1">
+      <w:hyperlink w:anchor="_Toc236041708" w:history="1">
         <w:r>
           <w:rPr>
             <w:rStyle w:val="Hipervnculo"/>
@@ -870,7 +871,7 @@
             <w:noProof/>
             <w:webHidden/>
           </w:rPr>
-          <w:instrText xml:space="preserve"> PAGEREF _Toc236040763 \h </w:instrText>
+          <w:instrText xml:space="preserve"> PAGEREF _Toc236041708 \h </w:instrText>
         </w:r>
         <w:r>
           <w:rPr>
@@ -918,7 +919,7 @@
           <w14:ligatures w14:val="standardContextual"/>
         </w:rPr>
       </w:pPr>
-      <w:hyperlink w:anchor="_Toc236040764" w:history="1">
+      <w:hyperlink w:anchor="_Toc236041709" w:history="1">
         <w:r>
           <w:rPr>
             <w:rStyle w:val="Hipervnculo"/>
@@ -964,7 +965,7 @@
             <w:noProof/>
             <w:webHidden/>
           </w:rPr>
-          <w:instrText xml:space="preserve"> PAGEREF _Toc236040764 \h </w:instrText>
+          <w:instrText xml:space="preserve"> PAGEREF _Toc236041709 \h </w:instrText>
         </w:r>
         <w:r>
           <w:rPr>
@@ -1011,13 +1012,27 @@
           <w14:ligatures w14:val="standardContextual"/>
         </w:rPr>
       </w:pPr>
-      <w:hyperlink w:anchor="_Toc236040765" w:history="1">
+      <w:hyperlink w:anchor="_Toc236041710" w:history="1">
         <w:r>
           <w:rPr>
             <w:rStyle w:val="Hipervnculo"/>
             <w:noProof/>
           </w:rPr>
-          <w:t>3.1 Modelos</w:t>
+          <w:t>3.1 Mod</w:t>
+        </w:r>
+        <w:r>
+          <w:rPr>
+            <w:rStyle w:val="Hipervnculo"/>
+            <w:noProof/>
+          </w:rPr>
+          <w:t>e</w:t>
+        </w:r>
+        <w:r>
+          <w:rPr>
+            <w:rStyle w:val="Hipervnculo"/>
+            <w:noProof/>
+          </w:rPr>
+          <w:t>los</w:t>
         </w:r>
         <w:r>
           <w:rPr>
@@ -1038,7 +1053,7 @@
             <w:noProof/>
             <w:webHidden/>
           </w:rPr>
-          <w:instrText xml:space="preserve"> PAGEREF _Toc236040765 \h </w:instrText>
+          <w:instrText xml:space="preserve"> PAGEREF _Toc236041710 \h </w:instrText>
         </w:r>
         <w:r>
           <w:rPr>
@@ -1085,7 +1100,7 @@
           <w14:ligatures w14:val="standardContextual"/>
         </w:rPr>
       </w:pPr>
-      <w:hyperlink w:anchor="_Toc236040766" w:history="1">
+      <w:hyperlink w:anchor="_Toc236041711" w:history="1">
         <w:r>
           <w:rPr>
             <w:rStyle w:val="Hipervnculo"/>
@@ -1112,7 +1127,7 @@
             <w:noProof/>
             <w:webHidden/>
           </w:rPr>
-          <w:instrText xml:space="preserve"> PAGEREF _Toc236040766 \h </w:instrText>
+          <w:instrText xml:space="preserve"> PAGEREF _Toc236041711 \h </w:instrText>
         </w:r>
         <w:r>
           <w:rPr>
@@ -1159,7 +1174,7 @@
           <w14:ligatures w14:val="standardContextual"/>
         </w:rPr>
       </w:pPr>
-      <w:hyperlink w:anchor="_Toc236040767" w:history="1">
+      <w:hyperlink w:anchor="_Toc236041712" w:history="1">
         <w:r>
           <w:rPr>
             <w:rStyle w:val="Hipervnculo"/>
@@ -1186,7 +1201,7 @@
             <w:noProof/>
             <w:webHidden/>
           </w:rPr>
-          <w:instrText xml:space="preserve"> PAGEREF _Toc236040767 \h </w:instrText>
+          <w:instrText xml:space="preserve"> PAGEREF _Toc236041712 \h </w:instrText>
         </w:r>
         <w:r>
           <w:rPr>
@@ -1234,7 +1249,7 @@
           <w14:ligatures w14:val="standardContextual"/>
         </w:rPr>
       </w:pPr>
-      <w:hyperlink w:anchor="_Toc236040768" w:history="1">
+      <w:hyperlink w:anchor="_Toc236041713" w:history="1">
         <w:r>
           <w:rPr>
             <w:rStyle w:val="Hipervnculo"/>
@@ -1280,7 +1295,7 @@
             <w:noProof/>
             <w:webHidden/>
           </w:rPr>
-          <w:instrText xml:space="preserve"> PAGEREF _Toc236040768 \h </w:instrText>
+          <w:instrText xml:space="preserve"> PAGEREF _Toc236041713 \h </w:instrText>
         </w:r>
         <w:r>
           <w:rPr>
@@ -1328,7 +1343,7 @@
           <w14:ligatures w14:val="standardContextual"/>
         </w:rPr>
       </w:pPr>
-      <w:hyperlink w:anchor="_Toc236040769" w:history="1">
+      <w:hyperlink w:anchor="_Toc236041714" w:history="1">
         <w:r>
           <w:rPr>
             <w:rStyle w:val="Hipervnculo"/>
@@ -1374,7 +1389,7 @@
             <w:noProof/>
             <w:webHidden/>
           </w:rPr>
-          <w:instrText xml:space="preserve"> PAGEREF _Toc236040769 \h </w:instrText>
+          <w:instrText xml:space="preserve"> PAGEREF _Toc236041714 \h </w:instrText>
         </w:r>
         <w:r>
           <w:rPr>
@@ -1409,6 +1424,7 @@
       <w:pPr>
         <w:pStyle w:val="TDC1"/>
         <w:tabs>
+          <w:tab w:val="left" w:pos="480"/>
           <w:tab w:val="right" w:leader="dot" w:pos="9350"/>
         </w:tabs>
         <w:rPr>
@@ -1421,23 +1437,42 @@
           <w14:ligatures w14:val="standardContextual"/>
         </w:rPr>
       </w:pPr>
-      <w:hyperlink w:anchor="_Toc236040770" w:history="1">
+      <w:hyperlink w:anchor="_Toc236041715" w:history="1">
         <w:r>
           <w:rPr>
             <w:rStyle w:val="Hipervnculo"/>
             <w:noProof/>
           </w:rPr>
-          <w:t>6. Conclusiones</w:t>
-        </w:r>
-        <w:r>
-          <w:rPr>
-            <w:noProof/>
-            <w:webHidden/>
+          <w:t>6.</w:t>
+        </w:r>
+        <w:r>
+          <w:rPr>
+            <w:rFonts w:asciiTheme="minorHAnsi" w:eastAsiaTheme="minorEastAsia" w:hAnsiTheme="minorHAnsi" w:cstheme="minorBidi"/>
+            <w:noProof/>
+            <w:kern w:val="2"/>
+            <w:sz w:val="24"/>
+            <w:szCs w:val="24"/>
+            <w:lang w:eastAsia="es-CL" w:bidi="ar-SA"/>
+            <w14:ligatures w14:val="standardContextual"/>
           </w:rPr>
           <w:tab/>
         </w:r>
         <w:r>
           <w:rPr>
+            <w:rStyle w:val="Hipervnculo"/>
+            <w:noProof/>
+          </w:rPr>
+          <w:t>Conclusiones</w:t>
+        </w:r>
+        <w:r>
+          <w:rPr>
+            <w:noProof/>
+            <w:webHidden/>
+          </w:rPr>
+          <w:tab/>
+        </w:r>
+        <w:r>
+          <w:rPr>
             <w:noProof/>
             <w:webHidden/>
           </w:rPr>
@@ -1448,7 +1483,7 @@
             <w:noProof/>
             <w:webHidden/>
           </w:rPr>
-          <w:instrText xml:space="preserve"> PAGEREF _Toc236040770 \h </w:instrText>
+          <w:instrText xml:space="preserve"> PAGEREF _Toc236041715 \h </w:instrText>
         </w:r>
         <w:r>
           <w:rPr>
@@ -1483,6 +1518,7 @@
       <w:pPr>
         <w:pStyle w:val="TDC1"/>
         <w:tabs>
+          <w:tab w:val="left" w:pos="480"/>
           <w:tab w:val="right" w:leader="dot" w:pos="9350"/>
         </w:tabs>
         <w:rPr>
@@ -1495,23 +1531,42 @@
           <w14:ligatures w14:val="standardContextual"/>
         </w:rPr>
       </w:pPr>
-      <w:hyperlink w:anchor="_Toc236040771" w:history="1">
+      <w:hyperlink w:anchor="_Toc236041716" w:history="1">
         <w:r>
           <w:rPr>
             <w:rStyle w:val="Hipervnculo"/>
             <w:noProof/>
           </w:rPr>
-          <w:t>7. Referencias</w:t>
-        </w:r>
-        <w:r>
-          <w:rPr>
-            <w:noProof/>
-            <w:webHidden/>
+          <w:t>7.</w:t>
+        </w:r>
+        <w:r>
+          <w:rPr>
+            <w:rFonts w:asciiTheme="minorHAnsi" w:eastAsiaTheme="minorEastAsia" w:hAnsiTheme="minorHAnsi" w:cstheme="minorBidi"/>
+            <w:noProof/>
+            <w:kern w:val="2"/>
+            <w:sz w:val="24"/>
+            <w:szCs w:val="24"/>
+            <w:lang w:eastAsia="es-CL" w:bidi="ar-SA"/>
+            <w14:ligatures w14:val="standardContextual"/>
           </w:rPr>
           <w:tab/>
         </w:r>
         <w:r>
           <w:rPr>
+            <w:rStyle w:val="Hipervnculo"/>
+            <w:noProof/>
+          </w:rPr>
+          <w:t>Github</w:t>
+        </w:r>
+        <w:r>
+          <w:rPr>
+            <w:noProof/>
+            <w:webHidden/>
+          </w:rPr>
+          <w:tab/>
+        </w:r>
+        <w:r>
+          <w:rPr>
             <w:noProof/>
             <w:webHidden/>
           </w:rPr>
@@ -1522,7 +1577,101 @@
             <w:noProof/>
             <w:webHidden/>
           </w:rPr>
-          <w:instrText xml:space="preserve"> PAGEREF _Toc236040771 \h </w:instrText>
+          <w:instrText xml:space="preserve"> PAGEREF _Toc236041716 \h </w:instrText>
+        </w:r>
+        <w:r>
+          <w:rPr>
+            <w:noProof/>
+            <w:webHidden/>
+          </w:rPr>
+        </w:r>
+        <w:r>
+          <w:rPr>
+            <w:noProof/>
+            <w:webHidden/>
+          </w:rPr>
+          <w:fldChar w:fldCharType="separate"/>
+        </w:r>
+        <w:r>
+          <w:rPr>
+            <w:noProof/>
+            <w:webHidden/>
+          </w:rPr>
+          <w:t>7</w:t>
+        </w:r>
+        <w:r>
+          <w:rPr>
+            <w:noProof/>
+            <w:webHidden/>
+          </w:rPr>
+          <w:fldChar w:fldCharType="end"/>
+        </w:r>
+      </w:hyperlink>
+    </w:p>
+    <w:p>
+      <w:pPr>
+        <w:pStyle w:val="TDC1"/>
+        <w:tabs>
+          <w:tab w:val="left" w:pos="480"/>
+          <w:tab w:val="right" w:leader="dot" w:pos="9350"/>
+        </w:tabs>
+        <w:rPr>
+          <w:rFonts w:asciiTheme="minorHAnsi" w:eastAsiaTheme="minorEastAsia" w:hAnsiTheme="minorHAnsi" w:cstheme="minorBidi"/>
+          <w:noProof/>
+          <w:kern w:val="2"/>
+          <w:sz w:val="24"/>
+          <w:szCs w:val="24"/>
+          <w:lang w:eastAsia="es-CL" w:bidi="ar-SA"/>
+          <w14:ligatures w14:val="standardContextual"/>
+        </w:rPr>
+      </w:pPr>
+      <w:hyperlink w:anchor="_Toc236041717" w:history="1">
+        <w:r>
+          <w:rPr>
+            <w:rStyle w:val="Hipervnculo"/>
+            <w:noProof/>
+          </w:rPr>
+          <w:t>8.</w:t>
+        </w:r>
+        <w:r>
+          <w:rPr>
+            <w:rFonts w:asciiTheme="minorHAnsi" w:eastAsiaTheme="minorEastAsia" w:hAnsiTheme="minorHAnsi" w:cstheme="minorBidi"/>
+            <w:noProof/>
+            <w:kern w:val="2"/>
+            <w:sz w:val="24"/>
+            <w:szCs w:val="24"/>
+            <w:lang w:eastAsia="es-CL" w:bidi="ar-SA"/>
+            <w14:ligatures w14:val="standardContextual"/>
+          </w:rPr>
+          <w:tab/>
+        </w:r>
+        <w:r>
+          <w:rPr>
+            <w:rStyle w:val="Hipervnculo"/>
+            <w:noProof/>
+          </w:rPr>
+          <w:t>Referencias</w:t>
+        </w:r>
+        <w:r>
+          <w:rPr>
+            <w:noProof/>
+            <w:webHidden/>
+          </w:rPr>
+          <w:tab/>
+        </w:r>
+        <w:r>
+          <w:rPr>
+            <w:noProof/>
+            <w:webHidden/>
+          </w:rPr>
+          <w:fldChar w:fldCharType="begin"/>
+        </w:r>
+        <w:r>
+          <w:rPr>
+            <w:noProof/>
+            <w:webHidden/>
+          </w:rPr>
+          <w:instrText xml:space="preserve"> PAGEREF _Toc236041717 \h </w:instrText>
         </w:r>
         <w:r>
           <w:rPr>
@@ -1580,7 +1729,7 @@
           <w:szCs w:val="22"/>
         </w:rPr>
       </w:pPr>
-      <w:bookmarkStart w:id="0" w:name="_Toc236040762"/>
+      <w:bookmarkStart w:id="0" w:name="_Toc236041707"/>
       <w:r>
         <w:rPr>
           <w:color w:val="9E1B32"/>
@@ -1834,7 +1983,7 @@
           <w:szCs w:val="22"/>
         </w:rPr>
       </w:pPr>
-      <w:bookmarkStart w:id="1" w:name="_Toc236040763"/>
+      <w:bookmarkStart w:id="1" w:name="_Toc236041708"/>
       <w:r>
         <w:rPr>
           <w:color w:val="9E1B32"/>
@@ -1946,7 +2095,7 @@
           <w:szCs w:val="22"/>
         </w:rPr>
       </w:pPr>
-      <w:bookmarkStart w:id="2" w:name="_Toc236040764"/>
+      <w:bookmarkStart w:id="2" w:name="_Toc236041709"/>
       <w:r>
         <w:rPr>
           <w:color w:val="9E1B32"/>
@@ -2700,7 +2849,7 @@
           <w:szCs w:val="22"/>
         </w:rPr>
       </w:pPr>
-      <w:bookmarkStart w:id="3" w:name="_Toc236040765"/>
+      <w:bookmarkStart w:id="3" w:name="_Toc236041710"/>
       <w:r>
         <w:rPr>
           <w:color w:val="9E1B32"/>
@@ -2943,7 +3092,7 @@
           <w:szCs w:val="22"/>
         </w:rPr>
       </w:pPr>
-      <w:bookmarkStart w:id="4" w:name="_Toc236040766"/>
+      <w:bookmarkStart w:id="4" w:name="_Toc236041711"/>
       <w:r>
         <w:rPr>
           <w:color w:val="9E1B32"/>
@@ -3067,7 +3216,7 @@
           <w:szCs w:val="22"/>
         </w:rPr>
       </w:pPr>
-      <w:bookmarkStart w:id="5" w:name="_Toc236040767"/>
+      <w:bookmarkStart w:id="5" w:name="_Toc236041712"/>
       <w:r>
         <w:rPr>
           <w:color w:val="9E1B32"/>
@@ -3215,7 +3364,7 @@
           <w:szCs w:val="22"/>
         </w:rPr>
       </w:pPr>
-      <w:bookmarkStart w:id="6" w:name="_Toc236040768"/>
+      <w:bookmarkStart w:id="6" w:name="_Toc236041713"/>
       <w:r>
         <w:rPr>
           <w:color w:val="9E1B32"/>
@@ -3590,7 +3739,7 @@
           <w:szCs w:val="22"/>
         </w:rPr>
       </w:pPr>
-      <w:bookmarkStart w:id="7" w:name="_Toc236040769"/>
+      <w:bookmarkStart w:id="7" w:name="_Toc236041714"/>
       <w:r>
         <w:rPr>
           <w:color w:val="9E1B32"/>
@@ -4081,6 +4230,10 @@
     <w:p>
       <w:pPr>
         <w:pStyle w:val="Ttulo1"/>
+        <w:numPr>
+          <w:ilvl w:val="0"/>
+          <w:numId w:val="10"/>
+        </w:numPr>
         <w:jc w:val="both"/>
         <w:rPr>
           <w:color w:val="9E1B32"/>
@@ -4088,14 +4241,14 @@
           <w:szCs w:val="22"/>
         </w:rPr>
       </w:pPr>
-      <w:bookmarkStart w:id="8" w:name="_Toc236040770"/>
+      <w:bookmarkStart w:id="8" w:name="_Toc236041715"/>
       <w:r>
         <w:rPr>
           <w:color w:val="9E1B32"/>
           <w:sz w:val="22"/>
           <w:szCs w:val="22"/>
         </w:rPr>
-        <w:t>6. Conclusiones</w:t>
+        <w:t>Conclusiones</w:t>
       </w:r>
       <w:bookmarkEnd w:id="8"/>
     </w:p>
@@ -4334,7 +4487,17 @@
     </w:p>
     <w:p>
       <w:pPr>
+        <w:contextualSpacing/>
+        <w:jc w:val="both"/>
+      </w:pPr>
+    </w:p>
+    <w:p>
+      <w:pPr>
         <w:pStyle w:val="Ttulo1"/>
+        <w:numPr>
+          <w:ilvl w:val="0"/>
+          <w:numId w:val="10"/>
+        </w:numPr>
         <w:jc w:val="both"/>
         <w:rPr>
           <w:color w:val="9E1B32"/>
@@ -4342,16 +4505,88 @@
           <w:szCs w:val="22"/>
         </w:rPr>
       </w:pPr>
-      <w:bookmarkStart w:id="9" w:name="_Toc236040771"/>
+      <w:bookmarkStart w:id="9" w:name="_Toc236041716"/>
+      <w:proofErr w:type="spellStart"/>
       <w:r>
         <w:rPr>
           <w:color w:val="9E1B32"/>
           <w:sz w:val="22"/>
           <w:szCs w:val="22"/>
         </w:rPr>
-        <w:t>7. Referencias</w:t>
+        <w:t>Github</w:t>
       </w:r>
       <w:bookmarkEnd w:id="9"/>
+      <w:proofErr w:type="spellEnd"/>
+    </w:p>
+    <w:p>
+      <w:pPr>
+        <w:contextualSpacing/>
+        <w:jc w:val="both"/>
+      </w:pPr>
+    </w:p>
+    <w:p>
+      <w:pPr>
+        <w:contextualSpacing/>
+        <w:jc w:val="both"/>
+      </w:pPr>
+      <w:r>
+        <w:t xml:space="preserve">Se indica </w:t>
+      </w:r>
+      <w:proofErr w:type="gramStart"/>
+      <w:r>
+        <w:t>link</w:t>
+      </w:r>
+      <w:proofErr w:type="gramEnd"/>
+      <w:r>
+        <w:t xml:space="preserve"> de </w:t>
+      </w:r>
+      <w:proofErr w:type="spellStart"/>
+      <w:r>
+        <w:t>github</w:t>
+      </w:r>
+      <w:proofErr w:type="spellEnd"/>
+      <w:r>
+        <w:t xml:space="preserve"> del código fuente</w:t>
+      </w:r>
+    </w:p>
+    <w:p>
+      <w:pPr>
+        <w:contextualSpacing/>
+        <w:jc w:val="both"/>
+      </w:pPr>
+      <w:hyperlink r:id="rId13" w:history="1">
+        <w:r>
+          <w:rPr>
+            <w:rStyle w:val="Hipervnculo"/>
+          </w:rPr>
+          <w:t>https://github.com/rrivasr12/StockControl</w:t>
+        </w:r>
+      </w:hyperlink>
+    </w:p>
+    <w:p>
+      <w:pPr>
+        <w:pStyle w:val="Ttulo1"/>
+        <w:numPr>
+          <w:ilvl w:val="0"/>
+          <w:numId w:val="10"/>
+        </w:numPr>
+        <w:jc w:val="both"/>
+        <w:rPr>
+          <w:color w:val="9E1B32"/>
+          <w:sz w:val="22"/>
+          <w:szCs w:val="22"/>
+        </w:rPr>
+      </w:pPr>
+      <w:bookmarkStart w:id="10" w:name="_Toc236041717"/>
+      <w:r>
+        <w:rPr>
+          <w:color w:val="9E1B32"/>
+          <w:sz w:val="22"/>
+          <w:szCs w:val="22"/>
+        </w:rPr>
+        <w:t>Referencias</w:t>
+      </w:r>
+      <w:bookmarkEnd w:id="10"/>
     </w:p>
     <w:p>
       <w:pPr>
@@ -6718,6 +6953,18 @@
       <w:ind w:left="220"/>
     </w:pPr>
   </w:style>
+  <w:style w:type="character" w:styleId="Mencinsinresolver">
+    <w:name w:val="Unresolved Mention"/>
+    <w:basedOn w:val="Fuentedeprrafopredeter"/>
+    <w:uiPriority w:val="99"/>
+    <w:semiHidden/>
+    <w:unhideWhenUsed/>
+    <w:rsid w:val="006146C9"/>
+    <w:rPr>
+      <w:color w:val="605E5C"/>
+      <w:shd w:val="clear" w:color="auto" w:fill="E1DFDD"/>
+    </w:rPr>
+  </w:style>
 </w:styles>
 </file>
 

</xml_diff>